<commit_message>
docs: agrega correcion del en la  semana 5
</commit_message>
<xml_diff>
--- a/PATRONES DE SOFTWARE PLATAFORMA DE VOTACIÓN ELECTRONICA.docx
+++ b/PATRONES DE SOFTWARE PLATAFORMA DE VOTACIÓN ELECTRONICA.docx
@@ -704,25 +704,7 @@
                 <w:noProof/>
                 <w:lang w:val="es-ES"/>
               </w:rPr>
-              <w:t xml:space="preserve"> 12/</w:t>
-            </w:r>
-            <w:r>
-              <w:rPr>
-                <w:rStyle w:val="Hipervnculo"/>
-                <w:rFonts w:ascii="Times New Roman" w:hAnsi="Times New Roman" w:cs="Times New Roman"/>
-                <w:noProof/>
-                <w:lang w:val="es-ES"/>
-              </w:rPr>
-              <w:t>0</w:t>
-            </w:r>
-            <w:r>
-              <w:rPr>
-                <w:rStyle w:val="Hipervnculo"/>
-                <w:rFonts w:ascii="Times New Roman" w:hAnsi="Times New Roman" w:cs="Times New Roman"/>
-                <w:noProof/>
-                <w:lang w:val="es-ES"/>
-              </w:rPr>
-              <w:t>9</w:t>
+              <w:t xml:space="preserve"> 12/09</w:t>
             </w:r>
             <w:r>
               <w:rPr>
@@ -17111,7 +17093,7 @@
           <w:color w:val="CCCCCC"/>
           <w:sz w:val="21"/>
           <w:szCs w:val="21"/>
-          <w:lang w:val="es-ES" w:eastAsia="es-ES"/>
+          <w:lang w:val="en-US" w:eastAsia="es-ES"/>
         </w:rPr>
       </w:pPr>
       <w:bookmarkStart w:id="3" w:name="_Hlk239450682"/>
@@ -17121,7 +17103,7 @@
           <w:color w:val="C586C0"/>
           <w:sz w:val="21"/>
           <w:szCs w:val="21"/>
-          <w:lang w:val="es-ES" w:eastAsia="es-ES"/>
+          <w:lang w:val="en-US" w:eastAsia="es-ES"/>
         </w:rPr>
         <w:t>if</w:t>
       </w:r>
@@ -17131,7 +17113,7 @@
           <w:color w:val="CCCCCC"/>
           <w:sz w:val="21"/>
           <w:szCs w:val="21"/>
-          <w:lang w:val="es-ES" w:eastAsia="es-ES"/>
+          <w:lang w:val="en-US" w:eastAsia="es-ES"/>
         </w:rPr>
         <w:t xml:space="preserve"> (</w:t>
       </w:r>
@@ -17141,7 +17123,7 @@
           <w:color w:val="9CDCFE"/>
           <w:sz w:val="21"/>
           <w:szCs w:val="21"/>
-          <w:lang w:val="es-ES" w:eastAsia="es-ES"/>
+          <w:lang w:val="en-US" w:eastAsia="es-ES"/>
         </w:rPr>
         <w:t>formato</w:t>
       </w:r>
@@ -17151,7 +17133,7 @@
           <w:color w:val="CCCCCC"/>
           <w:sz w:val="21"/>
           <w:szCs w:val="21"/>
-          <w:lang w:val="es-ES" w:eastAsia="es-ES"/>
+          <w:lang w:val="en-US" w:eastAsia="es-ES"/>
         </w:rPr>
         <w:t xml:space="preserve"> </w:t>
       </w:r>
@@ -17161,7 +17143,7 @@
           <w:color w:val="D4D4D4"/>
           <w:sz w:val="21"/>
           <w:szCs w:val="21"/>
-          <w:lang w:val="es-ES" w:eastAsia="es-ES"/>
+          <w:lang w:val="en-US" w:eastAsia="es-ES"/>
         </w:rPr>
         <w:t>===</w:t>
       </w:r>
@@ -17171,7 +17153,7 @@
           <w:color w:val="CCCCCC"/>
           <w:sz w:val="21"/>
           <w:szCs w:val="21"/>
-          <w:lang w:val="es-ES" w:eastAsia="es-ES"/>
+          <w:lang w:val="en-US" w:eastAsia="es-ES"/>
         </w:rPr>
         <w:t xml:space="preserve"> </w:t>
       </w:r>
@@ -17181,7 +17163,7 @@
           <w:color w:val="CE9178"/>
           <w:sz w:val="21"/>
           <w:szCs w:val="21"/>
-          <w:lang w:val="es-ES" w:eastAsia="es-ES"/>
+          <w:lang w:val="en-US" w:eastAsia="es-ES"/>
         </w:rPr>
         <w:t>'PDF'</w:t>
       </w:r>
@@ -17191,7 +17173,7 @@
           <w:color w:val="CCCCCC"/>
           <w:sz w:val="21"/>
           <w:szCs w:val="21"/>
-          <w:lang w:val="es-ES" w:eastAsia="es-ES"/>
+          <w:lang w:val="en-US" w:eastAsia="es-ES"/>
         </w:rPr>
         <w:t xml:space="preserve">) { </w:t>
       </w:r>
@@ -17423,7 +17405,7 @@
           <w:color w:val="CCCCCC"/>
           <w:sz w:val="21"/>
           <w:szCs w:val="21"/>
-          <w:lang w:val="es-ES" w:eastAsia="es-ES"/>
+          <w:lang w:val="en-US" w:eastAsia="es-ES"/>
         </w:rPr>
       </w:pPr>
       <w:r>
@@ -17432,7 +17414,7 @@
           <w:color w:val="9CDCFE"/>
           <w:sz w:val="21"/>
           <w:szCs w:val="21"/>
-          <w:lang w:val="es-ES" w:eastAsia="es-ES"/>
+          <w:lang w:val="en-US" w:eastAsia="es-ES"/>
         </w:rPr>
         <w:t>reporte</w:t>
       </w:r>
@@ -17442,7 +17424,7 @@
           <w:color w:val="CCCCCC"/>
           <w:sz w:val="21"/>
           <w:szCs w:val="21"/>
-          <w:lang w:val="es-ES" w:eastAsia="es-ES"/>
+          <w:lang w:val="en-US" w:eastAsia="es-ES"/>
         </w:rPr>
         <w:t xml:space="preserve"> </w:t>
       </w:r>
@@ -17452,7 +17434,7 @@
           <w:color w:val="D4D4D4"/>
           <w:sz w:val="21"/>
           <w:szCs w:val="21"/>
-          <w:lang w:val="es-ES" w:eastAsia="es-ES"/>
+          <w:lang w:val="en-US" w:eastAsia="es-ES"/>
         </w:rPr>
         <w:t>=</w:t>
       </w:r>
@@ -17462,7 +17444,7 @@
           <w:color w:val="CCCCCC"/>
           <w:sz w:val="21"/>
           <w:szCs w:val="21"/>
-          <w:lang w:val="es-ES" w:eastAsia="es-ES"/>
+          <w:lang w:val="en-US" w:eastAsia="es-ES"/>
         </w:rPr>
         <w:t xml:space="preserve"> </w:t>
       </w:r>
@@ -17472,7 +17454,7 @@
           <w:color w:val="569CD6"/>
           <w:sz w:val="21"/>
           <w:szCs w:val="21"/>
-          <w:lang w:val="es-ES" w:eastAsia="es-ES"/>
+          <w:lang w:val="en-US" w:eastAsia="es-ES"/>
         </w:rPr>
         <w:t>new</w:t>
       </w:r>
@@ -17482,7 +17464,7 @@
           <w:color w:val="CCCCCC"/>
           <w:sz w:val="21"/>
           <w:szCs w:val="21"/>
-          <w:lang w:val="es-ES" w:eastAsia="es-ES"/>
+          <w:lang w:val="en-US" w:eastAsia="es-ES"/>
         </w:rPr>
         <w:t xml:space="preserve"> </w:t>
       </w:r>
@@ -17492,7 +17474,7 @@
           <w:color w:val="4EC9B0"/>
           <w:sz w:val="21"/>
           <w:szCs w:val="21"/>
-          <w:lang w:val="es-ES" w:eastAsia="es-ES"/>
+          <w:lang w:val="en-US" w:eastAsia="es-ES"/>
         </w:rPr>
         <w:t>ReporteResultadosCSV</w:t>
       </w:r>
@@ -17502,7 +17484,7 @@
           <w:color w:val="CCCCCC"/>
           <w:sz w:val="21"/>
           <w:szCs w:val="21"/>
-          <w:lang w:val="es-ES" w:eastAsia="es-ES"/>
+          <w:lang w:val="en-US" w:eastAsia="es-ES"/>
         </w:rPr>
         <w:t xml:space="preserve">(); </w:t>
       </w:r>
@@ -17762,27 +17744,7 @@
           <w:sz w:val="24"/>
           <w:szCs w:val="24"/>
         </w:rPr>
-        <w:t xml:space="preserve">La estructura utilizada permite manejar diferentes formatos mediante </w:t>
-      </w:r>
-      <w:proofErr w:type="gramStart"/>
-      <w:r>
-        <w:rPr>
-          <w:rFonts w:ascii="Times New Roman" w:hAnsi="Times New Roman" w:cs="Times New Roman"/>
-          <w:bCs/>
-          <w:sz w:val="24"/>
-          <w:szCs w:val="24"/>
-        </w:rPr>
-        <w:t>productos concretos y creadores concretos</w:t>
-      </w:r>
-      <w:proofErr w:type="gramEnd"/>
-      <w:r>
-        <w:rPr>
-          <w:rFonts w:ascii="Times New Roman" w:hAnsi="Times New Roman" w:cs="Times New Roman"/>
-          <w:bCs/>
-          <w:sz w:val="24"/>
-          <w:szCs w:val="24"/>
-        </w:rPr>
-        <w:t>.</w:t>
+        <w:t>La estructura utilizada permite manejar diferentes formatos mediante productos concretos y creadores concretos.</w:t>
       </w:r>
     </w:p>
     <w:p>
@@ -18210,27 +18172,7 @@
           <w:sz w:val="24"/>
           <w:szCs w:val="24"/>
         </w:rPr>
-        <w:t>SRP (</w:t>
-      </w:r>
-      <w:proofErr w:type="gramStart"/>
-      <w:r>
-        <w:rPr>
-          <w:rFonts w:ascii="Times New Roman" w:hAnsi="Times New Roman" w:cs="Times New Roman"/>
-          <w:b/>
-          <w:sz w:val="24"/>
-          <w:szCs w:val="24"/>
-        </w:rPr>
-        <w:t>Single</w:t>
-      </w:r>
-      <w:proofErr w:type="gramEnd"/>
-      <w:r>
-        <w:rPr>
-          <w:rFonts w:ascii="Times New Roman" w:hAnsi="Times New Roman" w:cs="Times New Roman"/>
-          <w:b/>
-          <w:sz w:val="24"/>
-          <w:szCs w:val="24"/>
-        </w:rPr>
-        <w:t xml:space="preserve"> Responsibility Principle):</w:t>
+        <w:t>SRP (Single Responsibility Principle):</w:t>
       </w:r>
     </w:p>
     <w:p>
@@ -19491,24 +19433,14 @@
       <w:r>
         <w:t xml:space="preserve">Ilustración </w:t>
       </w:r>
-      <w:r>
-        <w:fldChar w:fldCharType="begin"/>
-      </w:r>
-      <w:r>
-        <w:instrText xml:space="preserve"> SEQ Ilustración \* ARABIC </w:instrText>
-      </w:r>
-      <w:r>
-        <w:fldChar w:fldCharType="separate"/>
-      </w:r>
-      <w:r>
-        <w:rPr>
-          <w:noProof/>
-        </w:rPr>
-        <w:t>1</w:t>
-      </w:r>
-      <w:r>
-        <w:fldChar w:fldCharType="end"/>
-      </w:r>
+      <w:fldSimple w:instr=" SEQ Ilustración \* ARABIC ">
+        <w:r>
+          <w:rPr>
+            <w:noProof/>
+          </w:rPr>
+          <w:t>1</w:t>
+        </w:r>
+      </w:fldSimple>
       <w:r>
         <w:t xml:space="preserve"> </w:t>
       </w:r>
@@ -19574,24 +19506,14 @@
       <w:r>
         <w:t xml:space="preserve">Ilustración </w:t>
       </w:r>
-      <w:r>
-        <w:fldChar w:fldCharType="begin"/>
-      </w:r>
-      <w:r>
-        <w:instrText xml:space="preserve"> SEQ Ilustración \* ARABIC </w:instrText>
-      </w:r>
-      <w:r>
-        <w:fldChar w:fldCharType="separate"/>
-      </w:r>
-      <w:r>
-        <w:rPr>
-          <w:noProof/>
-        </w:rPr>
-        <w:t>2</w:t>
-      </w:r>
-      <w:r>
-        <w:fldChar w:fldCharType="end"/>
-      </w:r>
+      <w:fldSimple w:instr=" SEQ Ilustración \* ARABIC ">
+        <w:r>
+          <w:rPr>
+            <w:noProof/>
+          </w:rPr>
+          <w:t>2</w:t>
+        </w:r>
+      </w:fldSimple>
       <w:r>
         <w:t xml:space="preserve"> </w:t>
       </w:r>
@@ -19667,24 +19589,14 @@
       <w:r>
         <w:t xml:space="preserve">Ilustración </w:t>
       </w:r>
-      <w:r>
-        <w:fldChar w:fldCharType="begin"/>
-      </w:r>
-      <w:r>
-        <w:instrText xml:space="preserve"> SEQ Ilustración \* ARABIC </w:instrText>
-      </w:r>
-      <w:r>
-        <w:fldChar w:fldCharType="separate"/>
-      </w:r>
-      <w:r>
-        <w:rPr>
-          <w:noProof/>
-        </w:rPr>
-        <w:t>3</w:t>
-      </w:r>
-      <w:r>
-        <w:fldChar w:fldCharType="end"/>
-      </w:r>
+      <w:fldSimple w:instr=" SEQ Ilustración \* ARABIC ">
+        <w:r>
+          <w:rPr>
+            <w:noProof/>
+          </w:rPr>
+          <w:t>3</w:t>
+        </w:r>
+      </w:fldSimple>
       <w:r>
         <w:t xml:space="preserve"> </w:t>
       </w:r>
@@ -19749,24 +19661,14 @@
       <w:r>
         <w:t xml:space="preserve">Ilustración </w:t>
       </w:r>
-      <w:r>
-        <w:fldChar w:fldCharType="begin"/>
-      </w:r>
-      <w:r>
-        <w:instrText xml:space="preserve"> SEQ Ilustración \* ARABIC </w:instrText>
-      </w:r>
-      <w:r>
-        <w:fldChar w:fldCharType="separate"/>
-      </w:r>
-      <w:r>
-        <w:rPr>
-          <w:noProof/>
-        </w:rPr>
-        <w:t>4</w:t>
-      </w:r>
-      <w:r>
-        <w:fldChar w:fldCharType="end"/>
-      </w:r>
+      <w:fldSimple w:instr=" SEQ Ilustración \* ARABIC ">
+        <w:r>
+          <w:rPr>
+            <w:noProof/>
+          </w:rPr>
+          <w:t>4</w:t>
+        </w:r>
+      </w:fldSimple>
       <w:r>
         <w:t xml:space="preserve"> </w:t>
       </w:r>
@@ -20578,6 +20480,7 @@
       <w:r>
         <w:rPr>
           <w:rFonts w:ascii="Times New Roman" w:hAnsi="Times New Roman" w:cs="Times New Roman"/>
+          <w:noProof/>
           <w:sz w:val="24"/>
           <w:szCs w:val="24"/>
         </w:rPr>
@@ -20964,31 +20867,7 @@
           <w:szCs w:val="24"/>
           <w:lang w:val="es-ES"/>
         </w:rPr>
-        <w:t>SRP (</w:t>
-      </w:r>
-      <w:proofErr w:type="gramStart"/>
-      <w:r>
-        <w:rPr>
-          <w:rFonts w:ascii="Times New Roman" w:hAnsi="Times New Roman" w:cs="Times New Roman"/>
-          <w:b/>
-          <w:bCs/>
-          <w:sz w:val="24"/>
-          <w:szCs w:val="24"/>
-          <w:lang w:val="es-ES"/>
-        </w:rPr>
-        <w:t>Single</w:t>
-      </w:r>
-      <w:proofErr w:type="gramEnd"/>
-      <w:r>
-        <w:rPr>
-          <w:rFonts w:ascii="Times New Roman" w:hAnsi="Times New Roman" w:cs="Times New Roman"/>
-          <w:b/>
-          <w:bCs/>
-          <w:sz w:val="24"/>
-          <w:szCs w:val="24"/>
-          <w:lang w:val="es-ES"/>
-        </w:rPr>
-        <w:t xml:space="preserve"> Responsibility Principle):</w:t>
+        <w:t>SRP (Single Responsibility Principle):</w:t>
       </w:r>
     </w:p>
     <w:p>
@@ -21271,15 +21150,15 @@
           <w:rFonts w:ascii="Times New Roman" w:hAnsi="Times New Roman" w:cs="Times New Roman"/>
           <w:sz w:val="24"/>
           <w:szCs w:val="24"/>
-          <w:lang w:val="es-ES"/>
-        </w:rPr>
-      </w:pPr>
-      <w:r>
-        <w:rPr>
-          <w:rFonts w:ascii="Times New Roman" w:hAnsi="Times New Roman" w:cs="Times New Roman"/>
-          <w:sz w:val="24"/>
-          <w:szCs w:val="24"/>
-          <w:lang w:val="es-ES"/>
+          <w:lang w:val="en-US"/>
+        </w:rPr>
+      </w:pPr>
+      <w:r>
+        <w:rPr>
+          <w:rFonts w:ascii="Times New Roman" w:hAnsi="Times New Roman" w:cs="Times New Roman"/>
+          <w:sz w:val="24"/>
+          <w:szCs w:val="24"/>
+          <w:lang w:val="en-US"/>
         </w:rPr>
         <w:t>eleccion-builder.js (Builder abstracto y Concrete Builder)</w:t>
       </w:r>
@@ -21292,7 +21171,7 @@
           <w:rFonts w:ascii="Times New Roman" w:hAnsi="Times New Roman" w:cs="Times New Roman"/>
           <w:sz w:val="24"/>
           <w:szCs w:val="24"/>
-          <w:lang w:val="es-ES"/>
+          <w:lang w:val="en-US"/>
         </w:rPr>
       </w:pPr>
     </w:p>
@@ -21471,6 +21350,7 @@
       <w:r>
         <w:rPr>
           <w:rFonts w:ascii="Times New Roman" w:hAnsi="Times New Roman" w:cs="Times New Roman"/>
+          <w:noProof/>
           <w:sz w:val="24"/>
           <w:szCs w:val="24"/>
           <w:lang w:val="en-US"/>
@@ -21593,6 +21473,7 @@
       <w:r>
         <w:rPr>
           <w:rFonts w:ascii="Times New Roman" w:hAnsi="Times New Roman" w:cs="Times New Roman"/>
+          <w:noProof/>
           <w:sz w:val="24"/>
           <w:szCs w:val="24"/>
           <w:lang w:val="es-ES"/>
@@ -21659,6 +21540,7 @@
       <w:r>
         <w:rPr>
           <w:rFonts w:ascii="Times New Roman" w:hAnsi="Times New Roman" w:cs="Times New Roman"/>
+          <w:noProof/>
           <w:sz w:val="24"/>
           <w:szCs w:val="24"/>
           <w:lang w:val="es-ES"/>
@@ -21703,6 +21585,7 @@
       <w:r>
         <w:rPr>
           <w:rFonts w:ascii="Times New Roman" w:hAnsi="Times New Roman" w:cs="Times New Roman"/>
+          <w:noProof/>
           <w:sz w:val="24"/>
           <w:szCs w:val="24"/>
           <w:lang w:val="es-ES"/>
@@ -21820,6 +21703,7 @@
       <w:r>
         <w:rPr>
           <w:rFonts w:ascii="Times New Roman" w:hAnsi="Times New Roman" w:cs="Times New Roman"/>
+          <w:noProof/>
           <w:sz w:val="24"/>
           <w:szCs w:val="24"/>
           <w:lang w:val="es-ES"/>
@@ -22278,6 +22162,7 @@
       <w:r>
         <w:rPr>
           <w:rFonts w:ascii="Times New Roman" w:hAnsi="Times New Roman" w:cs="Times New Roman"/>
+          <w:noProof/>
           <w:sz w:val="24"/>
           <w:szCs w:val="24"/>
           <w:lang w:val="es-ES"/>
@@ -22322,6 +22207,7 @@
       <w:r>
         <w:rPr>
           <w:rFonts w:ascii="Times New Roman" w:hAnsi="Times New Roman" w:cs="Times New Roman"/>
+          <w:noProof/>
           <w:sz w:val="24"/>
           <w:szCs w:val="24"/>
           <w:lang w:val="es-ES"/>
@@ -22365,6 +22251,7 @@
       <w:r>
         <w:rPr>
           <w:rFonts w:ascii="Times New Roman" w:hAnsi="Times New Roman" w:cs="Times New Roman"/>
+          <w:noProof/>
           <w:sz w:val="24"/>
           <w:szCs w:val="24"/>
           <w:lang w:val="es-ES"/>
@@ -22408,6 +22295,7 @@
       <w:r>
         <w:rPr>
           <w:rFonts w:ascii="Times New Roman" w:hAnsi="Times New Roman" w:cs="Times New Roman"/>
+          <w:noProof/>
           <w:sz w:val="24"/>
           <w:szCs w:val="24"/>
           <w:lang w:val="es-ES"/>
@@ -22942,40 +22830,21 @@
           <w:lang w:val="es-ES"/>
         </w:rPr>
       </w:pPr>
-      <w:r>
-        <w:rPr>
-          <w:rFonts w:ascii="Times New Roman" w:hAnsi="Times New Roman" w:cs="Times New Roman"/>
-          <w:sz w:val="24"/>
-          <w:szCs w:val="24"/>
-          <w:lang w:val="es-ES"/>
-        </w:rPr>
-        <w:t>[EVIDENCIA FOTOGRÁFICA AQUÍ — opcional: captura de node demo.js mostrando la integración con Factory Method]</w:t>
-      </w:r>
-    </w:p>
-    <w:p>
-      <w:pPr>
-        <w:jc w:val="both"/>
-        <w:rPr>
-          <w:rFonts w:ascii="Times New Roman" w:hAnsi="Times New Roman" w:cs="Times New Roman"/>
-          <w:sz w:val="24"/>
-          <w:szCs w:val="24"/>
-          <w:lang w:val="es-ES"/>
-        </w:rPr>
-      </w:pPr>
-    </w:p>
-    <w:p>
-      <w:pPr>
-        <w:jc w:val="both"/>
-        <w:rPr>
-          <w:rFonts w:ascii="Times New Roman" w:hAnsi="Times New Roman" w:cs="Times New Roman"/>
-          <w:sz w:val="24"/>
-          <w:szCs w:val="24"/>
-          <w:lang w:val="es-ES"/>
-        </w:rPr>
-      </w:pPr>
-      <w:r>
-        <w:rPr>
-          <w:rFonts w:ascii="Times New Roman" w:hAnsi="Times New Roman" w:cs="Times New Roman"/>
+    </w:p>
+    <w:p>
+      <w:pPr>
+        <w:jc w:val="both"/>
+        <w:rPr>
+          <w:rFonts w:ascii="Times New Roman" w:hAnsi="Times New Roman" w:cs="Times New Roman"/>
+          <w:sz w:val="24"/>
+          <w:szCs w:val="24"/>
+          <w:lang w:val="es-ES"/>
+        </w:rPr>
+      </w:pPr>
+      <w:r>
+        <w:rPr>
+          <w:rFonts w:ascii="Times New Roman" w:hAnsi="Times New Roman" w:cs="Times New Roman"/>
+          <w:noProof/>
           <w:sz w:val="24"/>
           <w:szCs w:val="24"/>
           <w:lang w:val="es-ES"/>
@@ -23041,6 +22910,7 @@
       <w:r>
         <w:rPr>
           <w:rFonts w:ascii="Times New Roman" w:hAnsi="Times New Roman" w:cs="Times New Roman"/>
+          <w:noProof/>
           <w:sz w:val="24"/>
           <w:szCs w:val="24"/>
           <w:lang w:val="es-ES"/>
@@ -25607,6 +25477,7 @@
   <w:style w:type="character" w:default="1" w:styleId="Fuentedeprrafopredeter">
     <w:name w:val="Default Paragraph Font"/>
     <w:uiPriority w:val="1"/>
+    <w:semiHidden/>
     <w:unhideWhenUsed/>
   </w:style>
   <w:style w:type="table" w:default="1" w:styleId="Tablanormal">

</xml_diff>

<commit_message>
Problemas con el documento corrupto?
</commit_message>
<xml_diff>
--- a/PATRONES DE SOFTWARE PLATAFORMA DE VOTACIÓN ELECTRONICA.docx
+++ b/PATRONES DE SOFTWARE PLATAFORMA DE VOTACIÓN ELECTRONICA.docx
@@ -12,6 +12,8 @@
           <w:lang w:val="es-ES"/>
         </w:rPr>
       </w:pPr>
+      <w:bookmarkStart w:id="0" w:name="_GoBack"/>
+      <w:bookmarkEnd w:id="0"/>
       <w:r>
         <w:rPr>
           <w:rFonts w:ascii="Times New Roman" w:hAnsi="Times New Roman" w:cs="Times New Roman"/>
@@ -807,7 +809,7 @@
           <w:lang w:val="es-ES"/>
         </w:rPr>
       </w:pPr>
-      <w:bookmarkStart w:id="0" w:name="_Toc240113603"/>
+      <w:bookmarkStart w:id="1" w:name="_Toc240113603"/>
       <w:r>
         <w:rPr>
           <w:rFonts w:ascii="Times New Roman" w:hAnsi="Times New Roman" w:cs="Times New Roman"/>
@@ -843,7 +845,7 @@
         </w:rPr>
         <w:t xml:space="preserve"> 15/08:</w:t>
       </w:r>
-      <w:bookmarkEnd w:id="0"/>
+      <w:bookmarkEnd w:id="1"/>
     </w:p>
     <w:p>
       <w:pPr>
@@ -1283,7 +1285,7 @@
           <w:lang w:val="es-ES"/>
         </w:rPr>
       </w:pPr>
-      <w:bookmarkStart w:id="1" w:name="_Toc240113604"/>
+      <w:bookmarkStart w:id="2" w:name="_Toc240113604"/>
       <w:r>
         <w:rPr>
           <w:rFonts w:ascii="Times New Roman" w:hAnsi="Times New Roman" w:cs="Times New Roman"/>
@@ -1306,7 +1308,7 @@
         </w:rPr>
         <w:t>22/08:</w:t>
       </w:r>
-      <w:bookmarkEnd w:id="1"/>
+      <w:bookmarkEnd w:id="2"/>
       <w:r>
         <w:rPr>
           <w:rFonts w:ascii="Times New Roman" w:hAnsi="Times New Roman" w:cs="Times New Roman"/>
@@ -17537,7 +17539,7 @@
           <w:lang w:val="es-ES"/>
         </w:rPr>
       </w:pPr>
-      <w:bookmarkStart w:id="2" w:name="_Toc240113605"/>
+      <w:bookmarkStart w:id="3" w:name="_Toc240113605"/>
       <w:r>
         <w:rPr>
           <w:rFonts w:ascii="Times New Roman" w:hAnsi="Times New Roman" w:cs="Times New Roman"/>
@@ -17561,7 +17563,7 @@
         </w:rPr>
         <w:t>04/09:</w:t>
       </w:r>
-      <w:bookmarkEnd w:id="2"/>
+      <w:bookmarkEnd w:id="3"/>
     </w:p>
     <w:p>
       <w:pPr>
@@ -17793,7 +17795,7 @@
           <w:lang w:val="en-US" w:eastAsia="es-ES"/>
         </w:rPr>
       </w:pPr>
-      <w:bookmarkStart w:id="3" w:name="_Hlk239450682"/>
+      <w:bookmarkStart w:id="4" w:name="_Hlk239450682"/>
       <w:proofErr w:type="gramStart"/>
       <w:r>
         <w:rPr>
@@ -18317,7 +18319,7 @@
         <w:t>Problema identificado</w:t>
       </w:r>
     </w:p>
-    <w:bookmarkEnd w:id="3"/>
+    <w:bookmarkEnd w:id="4"/>
     <w:p>
       <w:pPr>
         <w:spacing w:line="360" w:lineRule="auto"/>
@@ -20152,27 +20154,14 @@
       <w:r>
         <w:t xml:space="preserve">Ilustración </w:t>
       </w:r>
-      <w:r>
-        <w:fldChar w:fldCharType="begin"/>
-      </w:r>
-      <w:r>
-        <w:instrText xml:space="preserve"> SEQ Ilustración \* ARABIC </w:instrText>
-      </w:r>
-      <w:r>
-        <w:fldChar w:fldCharType="separate"/>
-      </w:r>
-      <w:r>
-        <w:rPr>
-          <w:noProof/>
-        </w:rPr>
-        <w:t>1</w:t>
-      </w:r>
-      <w:r>
-        <w:rPr>
-          <w:noProof/>
-        </w:rPr>
-        <w:fldChar w:fldCharType="end"/>
-      </w:r>
+      <w:fldSimple w:instr=" SEQ Ilustración \* ARABIC ">
+        <w:r>
+          <w:rPr>
+            <w:noProof/>
+          </w:rPr>
+          <w:t>1</w:t>
+        </w:r>
+      </w:fldSimple>
       <w:r>
         <w:t xml:space="preserve"> </w:t>
       </w:r>
@@ -20239,27 +20228,14 @@
       <w:r>
         <w:t xml:space="preserve">Ilustración </w:t>
       </w:r>
-      <w:r>
-        <w:fldChar w:fldCharType="begin"/>
-      </w:r>
-      <w:r>
-        <w:instrText xml:space="preserve"> SEQ Ilustración \* ARABIC </w:instrText>
-      </w:r>
-      <w:r>
-        <w:fldChar w:fldCharType="separate"/>
-      </w:r>
-      <w:r>
-        <w:rPr>
-          <w:noProof/>
-        </w:rPr>
-        <w:t>2</w:t>
-      </w:r>
-      <w:r>
-        <w:rPr>
-          <w:noProof/>
-        </w:rPr>
-        <w:fldChar w:fldCharType="end"/>
-      </w:r>
+      <w:fldSimple w:instr=" SEQ Ilustración \* ARABIC ">
+        <w:r>
+          <w:rPr>
+            <w:noProof/>
+          </w:rPr>
+          <w:t>2</w:t>
+        </w:r>
+      </w:fldSimple>
       <w:r>
         <w:t xml:space="preserve"> </w:t>
       </w:r>
@@ -20336,27 +20312,14 @@
       <w:r>
         <w:t xml:space="preserve">Ilustración </w:t>
       </w:r>
-      <w:r>
-        <w:fldChar w:fldCharType="begin"/>
-      </w:r>
-      <w:r>
-        <w:instrText xml:space="preserve"> SEQ Ilustración \* ARABIC </w:instrText>
-      </w:r>
-      <w:r>
-        <w:fldChar w:fldCharType="separate"/>
-      </w:r>
-      <w:r>
-        <w:rPr>
-          <w:noProof/>
-        </w:rPr>
-        <w:t>3</w:t>
-      </w:r>
-      <w:r>
-        <w:rPr>
-          <w:noProof/>
-        </w:rPr>
-        <w:fldChar w:fldCharType="end"/>
-      </w:r>
+      <w:fldSimple w:instr=" SEQ Ilustración \* ARABIC ">
+        <w:r>
+          <w:rPr>
+            <w:noProof/>
+          </w:rPr>
+          <w:t>3</w:t>
+        </w:r>
+      </w:fldSimple>
       <w:r>
         <w:t xml:space="preserve"> </w:t>
       </w:r>
@@ -20422,27 +20385,14 @@
       <w:r>
         <w:t xml:space="preserve">Ilustración </w:t>
       </w:r>
-      <w:r>
-        <w:fldChar w:fldCharType="begin"/>
-      </w:r>
-      <w:r>
-        <w:instrText xml:space="preserve"> SEQ Ilustración \* ARABIC </w:instrText>
-      </w:r>
-      <w:r>
-        <w:fldChar w:fldCharType="separate"/>
-      </w:r>
-      <w:r>
-        <w:rPr>
-          <w:noProof/>
-        </w:rPr>
-        <w:t>4</w:t>
-      </w:r>
-      <w:r>
-        <w:rPr>
-          <w:noProof/>
-        </w:rPr>
-        <w:fldChar w:fldCharType="end"/>
-      </w:r>
+      <w:fldSimple w:instr=" SEQ Ilustración \* ARABIC ">
+        <w:r>
+          <w:rPr>
+            <w:noProof/>
+          </w:rPr>
+          <w:t>4</w:t>
+        </w:r>
+      </w:fldSimple>
       <w:r>
         <w:t xml:space="preserve"> </w:t>
       </w:r>
@@ -20471,7 +20421,7 @@
           <w:lang w:val="es-ES"/>
         </w:rPr>
       </w:pPr>
-      <w:bookmarkStart w:id="4" w:name="_Toc240113606"/>
+      <w:bookmarkStart w:id="5" w:name="_Toc240113606"/>
       <w:r>
         <w:rPr>
           <w:rFonts w:ascii="Times New Roman" w:hAnsi="Times New Roman" w:cs="Times New Roman"/>
@@ -20495,7 +20445,7 @@
         </w:rPr>
         <w:t xml:space="preserve"> 12/09</w:t>
       </w:r>
-      <w:bookmarkEnd w:id="4"/>
+      <w:bookmarkEnd w:id="5"/>
     </w:p>
     <w:p>
       <w:pPr>
@@ -23756,8 +23706,6 @@
           <w:szCs w:val="24"/>
         </w:rPr>
       </w:pPr>
-      <w:bookmarkStart w:id="5" w:name="_GoBack"/>
-      <w:bookmarkEnd w:id="5"/>
     </w:p>
     <w:sectPr>
       <w:pgSz w:w="12240" w:h="15840"/>
@@ -26871,7 +26819,7 @@
 </file>
 
 <file path=customXml/itemProps1.xml><?xml version="1.0" encoding="utf-8"?>
-<ds:datastoreItem xmlns:ds="http://schemas.openxmlformats.org/officeDocument/2006/customXml" ds:itemID="{2209A698-5538-4E7F-BD52-16EA787B784D}">
+<ds:datastoreItem xmlns:ds="http://schemas.openxmlformats.org/officeDocument/2006/customXml" ds:itemID="{923C455B-6B4E-41B0-9D12-86076C45507A}">
   <ds:schemaRefs>
     <ds:schemaRef ds:uri="http://schemas.openxmlformats.org/officeDocument/2006/bibliography"/>
   </ds:schemaRefs>

</xml_diff>

<commit_message>
Correcion nueva documentacion corrupta
</commit_message>
<xml_diff>
--- a/PATRONES DE SOFTWARE PLATAFORMA DE VOTACIÓN ELECTRONICA.docx
+++ b/PATRONES DE SOFTWARE PLATAFORMA DE VOTACIÓN ELECTRONICA.docx
@@ -1,6 +1,6 @@
 
 <file path=word/document.xml><?xml version="1.0" encoding="utf-8"?>
-<w:document xmlns:wpc="http://schemas.microsoft.com/office/word/2010/wordprocessingCanvas" xmlns:cx="http://schemas.microsoft.com/office/drawing/2014/chartex" xmlns:cx1="http://schemas.microsoft.com/office/drawing/2015/9/8/chartex" xmlns:mc="http://schemas.openxmlformats.org/markup-compatibility/2006" xmlns:o="urn:schemas-microsoft-com:office:office" xmlns:r="http://schemas.openxmlformats.org/officeDocument/2006/relationships" xmlns:m="http://schemas.openxmlformats.org/officeDocument/2006/math" xmlns:v="urn:schemas-microsoft-com:vml" xmlns:wp14="http://schemas.microsoft.com/office/word/2010/wordprocessingDrawing" xmlns:wp="http://schemas.openxmlformats.org/drawingml/2006/wordprocessingDrawing" xmlns:w10="urn:schemas-microsoft-com:office:word" xmlns:w="http://schemas.openxmlformats.org/wordprocessingml/2006/main" xmlns:w14="http://schemas.microsoft.com/office/word/2010/wordml" xmlns:w15="http://schemas.microsoft.com/office/word/2012/wordml" xmlns:w16se="http://schemas.microsoft.com/office/word/2015/wordml/symex" xmlns:wpg="http://schemas.microsoft.com/office/word/2010/wordprocessingGroup" xmlns:wpi="http://schemas.microsoft.com/office/word/2010/wordprocessingInk" xmlns:wne="http://schemas.microsoft.com/office/word/2006/wordml" xmlns:wps="http://schemas.microsoft.com/office/word/2010/wordprocessingShape" mc:Ignorable="w14 w15 w16se wp14">
+<w:document xmlns:wpc="http://schemas.microsoft.com/office/word/2010/wordprocessingCanvas" xmlns:cx="http://schemas.microsoft.com/office/drawing/2014/chartex" xmlns:cx1="http://schemas.microsoft.com/office/drawing/2015/9/8/chartex" xmlns:cx2="http://schemas.microsoft.com/office/drawing/2015/10/21/chartex" xmlns:cx3="http://schemas.microsoft.com/office/drawing/2016/5/9/chartex" xmlns:cx4="http://schemas.microsoft.com/office/drawing/2016/5/10/chartex" xmlns:cx5="http://schemas.microsoft.com/office/drawing/2016/5/11/chartex" xmlns:cx6="http://schemas.microsoft.com/office/drawing/2016/5/12/chartex" xmlns:cx7="http://schemas.microsoft.com/office/drawing/2016/5/13/chartex" xmlns:cx8="http://schemas.microsoft.com/office/drawing/2016/5/14/chartex" xmlns:mc="http://schemas.openxmlformats.org/markup-compatibility/2006" xmlns:aink="http://schemas.microsoft.com/office/drawing/2016/ink" xmlns:am3d="http://schemas.microsoft.com/office/drawing/2017/model3d" xmlns:o="urn:schemas-microsoft-com:office:office" xmlns:oel="http://schemas.microsoft.com/office/2019/extlst" xmlns:r="http://schemas.openxmlformats.org/officeDocument/2006/relationships" xmlns:m="http://schemas.openxmlformats.org/officeDocument/2006/math" xmlns:v="urn:schemas-microsoft-com:vml" xmlns:wp14="http://schemas.microsoft.com/office/word/2010/wordprocessingDrawing" xmlns:wp="http://schemas.openxmlformats.org/drawingml/2006/wordprocessingDrawing" xmlns:w10="urn:schemas-microsoft-com:office:word" xmlns:w="http://schemas.openxmlformats.org/wordprocessingml/2006/main" xmlns:w14="http://schemas.microsoft.com/office/word/2010/wordml" xmlns:w15="http://schemas.microsoft.com/office/word/2012/wordml" xmlns:w16cex="http://schemas.microsoft.com/office/word/2018/wordml/cex" xmlns:w16cid="http://schemas.microsoft.com/office/word/2016/wordml/cid" xmlns:w16="http://schemas.microsoft.com/office/word/2018/wordml" xmlns:w16du="http://schemas.microsoft.com/office/word/2023/wordml/word16du" xmlns:w16sdtdh="http://schemas.microsoft.com/office/word/2020/wordml/sdtdatahash" xmlns:w16sdtfl="http://schemas.microsoft.com/office/word/2024/wordml/sdtformatlock" xmlns:w16se="http://schemas.microsoft.com/office/word/2015/wordml/symex" xmlns:wpg="http://schemas.microsoft.com/office/word/2010/wordprocessingGroup" xmlns:wpi="http://schemas.microsoft.com/office/word/2010/wordprocessingInk" xmlns:wne="http://schemas.microsoft.com/office/word/2006/wordml" xmlns:wps="http://schemas.microsoft.com/office/word/2010/wordprocessingShape" mc:Ignorable="w14 w15 w16se w16cid w16 w16cex w16sdtdh w16sdtfl w16du wp14">
   <w:body>
     <w:p>
       <w:pPr>
@@ -12,8 +12,6 @@
           <w:lang w:val="es-ES"/>
         </w:rPr>
       </w:pPr>
-      <w:bookmarkStart w:id="0" w:name="_GoBack"/>
-      <w:bookmarkEnd w:id="0"/>
       <w:r>
         <w:rPr>
           <w:rFonts w:ascii="Times New Roman" w:hAnsi="Times New Roman" w:cs="Times New Roman"/>
@@ -809,7 +807,7 @@
           <w:lang w:val="es-ES"/>
         </w:rPr>
       </w:pPr>
-      <w:bookmarkStart w:id="1" w:name="_Toc240113603"/>
+      <w:bookmarkStart w:id="0" w:name="_Toc240113603"/>
       <w:r>
         <w:rPr>
           <w:rFonts w:ascii="Times New Roman" w:hAnsi="Times New Roman" w:cs="Times New Roman"/>
@@ -845,7 +843,7 @@
         </w:rPr>
         <w:t xml:space="preserve"> 15/08:</w:t>
       </w:r>
-      <w:bookmarkEnd w:id="1"/>
+      <w:bookmarkEnd w:id="0"/>
     </w:p>
     <w:p>
       <w:pPr>
@@ -1285,7 +1283,7 @@
           <w:lang w:val="es-ES"/>
         </w:rPr>
       </w:pPr>
-      <w:bookmarkStart w:id="2" w:name="_Toc240113604"/>
+      <w:bookmarkStart w:id="1" w:name="_Toc240113604"/>
       <w:r>
         <w:rPr>
           <w:rFonts w:ascii="Times New Roman" w:hAnsi="Times New Roman" w:cs="Times New Roman"/>
@@ -1308,7 +1306,7 @@
         </w:rPr>
         <w:t>22/08:</w:t>
       </w:r>
-      <w:bookmarkEnd w:id="2"/>
+      <w:bookmarkEnd w:id="1"/>
       <w:r>
         <w:rPr>
           <w:rFonts w:ascii="Times New Roman" w:hAnsi="Times New Roman" w:cs="Times New Roman"/>
@@ -1546,27 +1544,7 @@
           <w:sz w:val="24"/>
           <w:lang w:val="es-ES"/>
         </w:rPr>
-        <w:t>Un método estático público (</w:t>
-      </w:r>
-      <w:proofErr w:type="gramStart"/>
-      <w:r>
-        <w:rPr>
-          <w:rFonts w:ascii="Times New Roman" w:hAnsi="Times New Roman" w:cs="Times New Roman"/>
-          <w:bCs/>
-          <w:sz w:val="24"/>
-          <w:lang w:val="es-ES"/>
-        </w:rPr>
-        <w:t>obtenerInstancia(</w:t>
-      </w:r>
-      <w:proofErr w:type="gramEnd"/>
-      <w:r>
-        <w:rPr>
-          <w:rFonts w:ascii="Times New Roman" w:hAnsi="Times New Roman" w:cs="Times New Roman"/>
-          <w:bCs/>
-          <w:sz w:val="24"/>
-          <w:lang w:val="es-ES"/>
-        </w:rPr>
-        <w:t>)) que actúa como la única puerta de entrada permitida (aplicando lazy initialization).</w:t>
+        <w:t>Un método estático público (obtenerInstancia()) que actúa como la única puerta de entrada permitida (aplicando lazy initialization).</w:t>
       </w:r>
     </w:p>
     <w:p>
@@ -2137,7 +2115,6 @@
         </w:rPr>
         <w:t xml:space="preserve">  </w:t>
       </w:r>
-      <w:proofErr w:type="gramStart"/>
       <w:r>
         <w:rPr>
           <w:rFonts w:ascii="Consolas" w:eastAsia="Times New Roman" w:hAnsi="Consolas" w:cs="Times New Roman"/>
@@ -2156,18 +2133,7 @@
           <w:szCs w:val="21"/>
           <w:lang w:eastAsia="es-CO"/>
         </w:rPr>
-        <w:t>(</w:t>
-      </w:r>
-      <w:proofErr w:type="gramEnd"/>
-      <w:r>
-        <w:rPr>
-          <w:rFonts w:ascii="Consolas" w:eastAsia="Times New Roman" w:hAnsi="Consolas" w:cs="Times New Roman"/>
-          <w:color w:val="DAD6DA"/>
-          <w:sz w:val="21"/>
-          <w:szCs w:val="21"/>
-          <w:lang w:eastAsia="es-CO"/>
-        </w:rPr>
-        <w:t>) {</w:t>
+        <w:t>() {</w:t>
       </w:r>
     </w:p>
     <w:p>
@@ -2288,7 +2254,6 @@
         </w:rPr>
         <w:t>(</w:t>
       </w:r>
-      <w:proofErr w:type="gramStart"/>
       <w:r>
         <w:rPr>
           <w:rFonts w:ascii="Consolas" w:eastAsia="Times New Roman" w:hAnsi="Consolas" w:cs="Times New Roman"/>
@@ -2317,18 +2282,7 @@
           <w:szCs w:val="21"/>
           <w:lang w:eastAsia="es-CO"/>
         </w:rPr>
-        <w:t>#</w:t>
-      </w:r>
-      <w:proofErr w:type="gramEnd"/>
-      <w:r>
-        <w:rPr>
-          <w:rFonts w:ascii="Consolas" w:eastAsia="Times New Roman" w:hAnsi="Consolas" w:cs="Times New Roman"/>
-          <w:color w:val="F8F8F2"/>
-          <w:sz w:val="21"/>
-          <w:szCs w:val="21"/>
-          <w:lang w:eastAsia="es-CO"/>
-        </w:rPr>
-        <w:t>instancia)</w:t>
+        <w:t>#instancia)</w:t>
       </w:r>
       <w:r>
         <w:rPr>
@@ -2405,7 +2359,6 @@
         </w:rPr>
         <w:t xml:space="preserve"> </w:t>
       </w:r>
-      <w:proofErr w:type="gramStart"/>
       <w:r>
         <w:rPr>
           <w:rFonts w:ascii="Consolas" w:eastAsia="Times New Roman" w:hAnsi="Consolas" w:cs="Times New Roman"/>
@@ -2428,7 +2381,6 @@
         </w:rPr>
         <w:t>(</w:t>
       </w:r>
-      <w:proofErr w:type="gramEnd"/>
       <w:r>
         <w:rPr>
           <w:rFonts w:ascii="Consolas" w:eastAsia="Times New Roman" w:hAnsi="Consolas" w:cs="Times New Roman"/>
@@ -2617,7 +2569,6 @@
         </w:rPr>
         <w:t>this</w:t>
       </w:r>
-      <w:proofErr w:type="gramStart"/>
       <w:r>
         <w:rPr>
           <w:rFonts w:ascii="Consolas" w:eastAsia="Times New Roman" w:hAnsi="Consolas" w:cs="Times New Roman"/>
@@ -2636,18 +2587,7 @@
           <w:szCs w:val="21"/>
           <w:lang w:val="en-US" w:eastAsia="es-CO"/>
         </w:rPr>
-        <w:t>#</w:t>
-      </w:r>
-      <w:proofErr w:type="gramEnd"/>
-      <w:r>
-        <w:rPr>
-          <w:rFonts w:ascii="Consolas" w:eastAsia="Times New Roman" w:hAnsi="Consolas" w:cs="Times New Roman"/>
-          <w:color w:val="F8F8F2"/>
-          <w:sz w:val="21"/>
-          <w:szCs w:val="21"/>
-          <w:lang w:val="en-US" w:eastAsia="es-CO"/>
-        </w:rPr>
-        <w:t>config</w:t>
+        <w:t>#config</w:t>
       </w:r>
       <w:r>
         <w:rPr>
@@ -2702,7 +2642,6 @@
         </w:rPr>
         <w:t xml:space="preserve">      </w:t>
       </w:r>
-      <w:proofErr w:type="gramStart"/>
       <w:r>
         <w:rPr>
           <w:rFonts w:ascii="Consolas" w:eastAsia="Times New Roman" w:hAnsi="Consolas" w:cs="Times New Roman"/>
@@ -2713,7 +2652,6 @@
         </w:rPr>
         <w:t>dbHost</w:t>
       </w:r>
-      <w:proofErr w:type="gramEnd"/>
       <w:r>
         <w:rPr>
           <w:rFonts w:ascii="Consolas" w:eastAsia="Times New Roman" w:hAnsi="Consolas" w:cs="Times New Roman"/>
@@ -2817,7 +2755,6 @@
         </w:rPr>
         <w:t xml:space="preserve">      </w:t>
       </w:r>
-      <w:proofErr w:type="gramStart"/>
       <w:r>
         <w:rPr>
           <w:rFonts w:ascii="Consolas" w:eastAsia="Times New Roman" w:hAnsi="Consolas" w:cs="Times New Roman"/>
@@ -2828,7 +2765,6 @@
         </w:rPr>
         <w:t>dbPort</w:t>
       </w:r>
-      <w:proofErr w:type="gramEnd"/>
       <w:r>
         <w:rPr>
           <w:rFonts w:ascii="Consolas" w:eastAsia="Times New Roman" w:hAnsi="Consolas" w:cs="Times New Roman"/>
@@ -3032,7 +2968,6 @@
         </w:rPr>
         <w:t xml:space="preserve">      </w:t>
       </w:r>
-      <w:proofErr w:type="gramStart"/>
       <w:r>
         <w:rPr>
           <w:rFonts w:ascii="Consolas" w:eastAsia="Times New Roman" w:hAnsi="Consolas" w:cs="Times New Roman"/>
@@ -3043,7 +2978,6 @@
         </w:rPr>
         <w:t>dbUser</w:t>
       </w:r>
-      <w:proofErr w:type="gramEnd"/>
       <w:r>
         <w:rPr>
           <w:rFonts w:ascii="Consolas" w:eastAsia="Times New Roman" w:hAnsi="Consolas" w:cs="Times New Roman"/>
@@ -3147,7 +3081,6 @@
         </w:rPr>
         <w:t xml:space="preserve">      </w:t>
       </w:r>
-      <w:proofErr w:type="gramStart"/>
       <w:r>
         <w:rPr>
           <w:rFonts w:ascii="Consolas" w:eastAsia="Times New Roman" w:hAnsi="Consolas" w:cs="Times New Roman"/>
@@ -3158,7 +3091,6 @@
         </w:rPr>
         <w:t>dbPass</w:t>
       </w:r>
-      <w:proofErr w:type="gramEnd"/>
       <w:r>
         <w:rPr>
           <w:rFonts w:ascii="Consolas" w:eastAsia="Times New Roman" w:hAnsi="Consolas" w:cs="Times New Roman"/>
@@ -3262,7 +3194,6 @@
         </w:rPr>
         <w:t xml:space="preserve">      </w:t>
       </w:r>
-      <w:proofErr w:type="gramStart"/>
       <w:r>
         <w:rPr>
           <w:rFonts w:ascii="Consolas" w:eastAsia="Times New Roman" w:hAnsi="Consolas" w:cs="Times New Roman"/>
@@ -3273,7 +3204,6 @@
         </w:rPr>
         <w:t>apiKey</w:t>
       </w:r>
-      <w:proofErr w:type="gramEnd"/>
       <w:r>
         <w:rPr>
           <w:rFonts w:ascii="Consolas" w:eastAsia="Times New Roman" w:hAnsi="Consolas" w:cs="Times New Roman"/>
@@ -3407,7 +3337,6 @@
         </w:rPr>
         <w:t xml:space="preserve"> </w:t>
       </w:r>
-      <w:proofErr w:type="gramStart"/>
       <w:r>
         <w:rPr>
           <w:rFonts w:ascii="Consolas" w:eastAsia="Times New Roman" w:hAnsi="Consolas" w:cs="Times New Roman"/>
@@ -3426,18 +3355,7 @@
           <w:szCs w:val="21"/>
           <w:lang w:eastAsia="es-CO"/>
         </w:rPr>
-        <w:t>(</w:t>
-      </w:r>
-      <w:proofErr w:type="gramEnd"/>
-      <w:r>
-        <w:rPr>
-          <w:rFonts w:ascii="Consolas" w:eastAsia="Times New Roman" w:hAnsi="Consolas" w:cs="Times New Roman"/>
-          <w:color w:val="F8F8F2"/>
-          <w:sz w:val="21"/>
-          <w:szCs w:val="21"/>
-          <w:lang w:eastAsia="es-CO"/>
-        </w:rPr>
-        <w:t>process</w:t>
+        <w:t>(process</w:t>
       </w:r>
       <w:r>
         <w:rPr>
@@ -3602,7 +3520,6 @@
         </w:rPr>
         <w:t xml:space="preserve">      </w:t>
       </w:r>
-      <w:proofErr w:type="gramStart"/>
       <w:r>
         <w:rPr>
           <w:rFonts w:ascii="Consolas" w:eastAsia="Times New Roman" w:hAnsi="Consolas" w:cs="Times New Roman"/>
@@ -3613,7 +3530,6 @@
         </w:rPr>
         <w:t>timeout</w:t>
       </w:r>
-      <w:proofErr w:type="gramEnd"/>
       <w:r>
         <w:rPr>
           <w:rFonts w:ascii="Consolas" w:eastAsia="Times New Roman" w:hAnsi="Consolas" w:cs="Times New Roman"/>
@@ -3817,7 +3733,6 @@
         </w:rPr>
         <w:t xml:space="preserve">      </w:t>
       </w:r>
-      <w:proofErr w:type="gramStart"/>
       <w:r>
         <w:rPr>
           <w:rFonts w:ascii="Consolas" w:eastAsia="Times New Roman" w:hAnsi="Consolas" w:cs="Times New Roman"/>
@@ -3828,7 +3743,6 @@
         </w:rPr>
         <w:t>smtpHost</w:t>
       </w:r>
-      <w:proofErr w:type="gramEnd"/>
       <w:r>
         <w:rPr>
           <w:rFonts w:ascii="Consolas" w:eastAsia="Times New Roman" w:hAnsi="Consolas" w:cs="Times New Roman"/>
@@ -3932,7 +3846,6 @@
         </w:rPr>
         <w:t xml:space="preserve">      </w:t>
       </w:r>
-      <w:proofErr w:type="gramStart"/>
       <w:r>
         <w:rPr>
           <w:rFonts w:ascii="Consolas" w:eastAsia="Times New Roman" w:hAnsi="Consolas" w:cs="Times New Roman"/>
@@ -3943,7 +3856,6 @@
         </w:rPr>
         <w:t>smtpPort</w:t>
       </w:r>
-      <w:proofErr w:type="gramEnd"/>
       <w:r>
         <w:rPr>
           <w:rFonts w:ascii="Consolas" w:eastAsia="Times New Roman" w:hAnsi="Consolas" w:cs="Times New Roman"/>
@@ -4147,7 +4059,6 @@
         </w:rPr>
         <w:t xml:space="preserve">      </w:t>
       </w:r>
-      <w:proofErr w:type="gramStart"/>
       <w:r>
         <w:rPr>
           <w:rFonts w:ascii="Consolas" w:eastAsia="Times New Roman" w:hAnsi="Consolas" w:cs="Times New Roman"/>
@@ -4158,7 +4069,6 @@
         </w:rPr>
         <w:t>smtpUser</w:t>
       </w:r>
-      <w:proofErr w:type="gramEnd"/>
       <w:r>
         <w:rPr>
           <w:rFonts w:ascii="Consolas" w:eastAsia="Times New Roman" w:hAnsi="Consolas" w:cs="Times New Roman"/>
@@ -4262,7 +4172,6 @@
         </w:rPr>
         <w:t xml:space="preserve">      </w:t>
       </w:r>
-      <w:proofErr w:type="gramStart"/>
       <w:r>
         <w:rPr>
           <w:rFonts w:ascii="Consolas" w:eastAsia="Times New Roman" w:hAnsi="Consolas" w:cs="Times New Roman"/>
@@ -4273,7 +4182,6 @@
         </w:rPr>
         <w:t>smtpPass</w:t>
       </w:r>
-      <w:proofErr w:type="gramEnd"/>
       <w:r>
         <w:rPr>
           <w:rFonts w:ascii="Consolas" w:eastAsia="Times New Roman" w:hAnsi="Consolas" w:cs="Times New Roman"/>
@@ -4423,7 +4331,6 @@
         </w:rPr>
         <w:t xml:space="preserve">    </w:t>
       </w:r>
-      <w:proofErr w:type="gramStart"/>
       <w:r>
         <w:rPr>
           <w:rFonts w:ascii="Consolas" w:eastAsia="Times New Roman" w:hAnsi="Consolas" w:cs="Times New Roman"/>
@@ -4454,18 +4361,7 @@
           <w:szCs w:val="21"/>
           <w:lang w:eastAsia="es-CO"/>
         </w:rPr>
-        <w:t>#</w:t>
-      </w:r>
-      <w:proofErr w:type="gramEnd"/>
-      <w:r>
-        <w:rPr>
-          <w:rFonts w:ascii="Consolas" w:eastAsia="Times New Roman" w:hAnsi="Consolas" w:cs="Times New Roman"/>
-          <w:color w:val="50FA7B"/>
-          <w:sz w:val="21"/>
-          <w:szCs w:val="21"/>
-          <w:lang w:eastAsia="es-CO"/>
-        </w:rPr>
-        <w:t>validarConfiguracionCritica</w:t>
+        <w:t>#validarConfiguracionCritica</w:t>
       </w:r>
       <w:r>
         <w:rPr>
@@ -4510,7 +4406,6 @@
         </w:rPr>
         <w:t xml:space="preserve">    </w:t>
       </w:r>
-      <w:proofErr w:type="gramStart"/>
       <w:r>
         <w:rPr>
           <w:rFonts w:ascii="Consolas" w:eastAsia="Times New Roman" w:hAnsi="Consolas" w:cs="Times New Roman"/>
@@ -4539,18 +4434,7 @@
           <w:szCs w:val="21"/>
           <w:lang w:eastAsia="es-CO"/>
         </w:rPr>
-        <w:t>#</w:t>
-      </w:r>
-      <w:proofErr w:type="gramEnd"/>
-      <w:r>
-        <w:rPr>
-          <w:rFonts w:ascii="Consolas" w:eastAsia="Times New Roman" w:hAnsi="Consolas" w:cs="Times New Roman"/>
-          <w:color w:val="F8F8F2"/>
-          <w:sz w:val="21"/>
-          <w:szCs w:val="21"/>
-          <w:lang w:eastAsia="es-CO"/>
-        </w:rPr>
-        <w:t>instancia</w:t>
+        <w:t>#instancia</w:t>
       </w:r>
       <w:r>
         <w:rPr>
@@ -4663,7 +4547,6 @@
         </w:rPr>
         <w:t>  #</w:t>
       </w:r>
-      <w:proofErr w:type="gramStart"/>
       <w:r>
         <w:rPr>
           <w:rFonts w:ascii="Consolas" w:eastAsia="Times New Roman" w:hAnsi="Consolas" w:cs="Times New Roman"/>
@@ -4682,18 +4565,7 @@
           <w:szCs w:val="21"/>
           <w:lang w:eastAsia="es-CO"/>
         </w:rPr>
-        <w:t>(</w:t>
-      </w:r>
-      <w:proofErr w:type="gramEnd"/>
-      <w:r>
-        <w:rPr>
-          <w:rFonts w:ascii="Consolas" w:eastAsia="Times New Roman" w:hAnsi="Consolas" w:cs="Times New Roman"/>
-          <w:color w:val="DAD6DA"/>
-          <w:sz w:val="21"/>
-          <w:szCs w:val="21"/>
-          <w:lang w:eastAsia="es-CO"/>
-        </w:rPr>
-        <w:t>) {</w:t>
+        <w:t>() {</w:t>
       </w:r>
     </w:p>
     <w:p>
@@ -4784,7 +4656,6 @@
         </w:rPr>
         <w:t xml:space="preserve">    </w:t>
       </w:r>
-      <w:proofErr w:type="gramStart"/>
       <w:r>
         <w:rPr>
           <w:rFonts w:ascii="Consolas" w:eastAsia="Times New Roman" w:hAnsi="Consolas" w:cs="Times New Roman"/>
@@ -4795,7 +4666,6 @@
         </w:rPr>
         <w:t>const</w:t>
       </w:r>
-      <w:proofErr w:type="gramEnd"/>
       <w:r>
         <w:rPr>
           <w:rFonts w:ascii="Consolas" w:eastAsia="Times New Roman" w:hAnsi="Consolas" w:cs="Times New Roman"/>
@@ -5029,7 +4899,6 @@
         </w:rPr>
         <w:t xml:space="preserve">    </w:t>
       </w:r>
-      <w:proofErr w:type="gramStart"/>
       <w:r>
         <w:rPr>
           <w:rFonts w:ascii="Consolas" w:eastAsia="Times New Roman" w:hAnsi="Consolas" w:cs="Times New Roman"/>
@@ -5040,7 +4909,6 @@
         </w:rPr>
         <w:t>const</w:t>
       </w:r>
-      <w:proofErr w:type="gramEnd"/>
       <w:r>
         <w:rPr>
           <w:rFonts w:ascii="Consolas" w:eastAsia="Times New Roman" w:hAnsi="Consolas" w:cs="Times New Roman"/>
@@ -5300,7 +5168,6 @@
         </w:rPr>
         <w:t xml:space="preserve">    </w:t>
       </w:r>
-      <w:proofErr w:type="gramStart"/>
       <w:r>
         <w:rPr>
           <w:rFonts w:ascii="Consolas" w:eastAsia="Times New Roman" w:hAnsi="Consolas" w:cs="Times New Roman"/>
@@ -5311,7 +5178,6 @@
         </w:rPr>
         <w:t>if</w:t>
       </w:r>
-      <w:proofErr w:type="gramEnd"/>
       <w:r>
         <w:rPr>
           <w:rFonts w:ascii="Consolas" w:eastAsia="Times New Roman" w:hAnsi="Consolas" w:cs="Times New Roman"/>
@@ -5487,7 +5353,6 @@
         </w:rPr>
         <w:t xml:space="preserve"> </w:t>
       </w:r>
-      <w:proofErr w:type="gramStart"/>
       <w:r>
         <w:rPr>
           <w:rFonts w:ascii="Consolas" w:eastAsia="Times New Roman" w:hAnsi="Consolas" w:cs="Times New Roman"/>
@@ -5510,7 +5375,6 @@
         </w:rPr>
         <w:t>(</w:t>
       </w:r>
-      <w:proofErr w:type="gramEnd"/>
     </w:p>
     <w:p>
       <w:pPr>
@@ -5554,7 +5418,6 @@
         </w:rPr>
         <w:t>${</w:t>
       </w:r>
-      <w:proofErr w:type="gramStart"/>
       <w:r>
         <w:rPr>
           <w:rFonts w:ascii="Consolas" w:eastAsia="Times New Roman" w:hAnsi="Consolas" w:cs="Times New Roman"/>
@@ -5585,7 +5448,6 @@
         </w:rPr>
         <w:t>join</w:t>
       </w:r>
-      <w:proofErr w:type="gramEnd"/>
       <w:r>
         <w:rPr>
           <w:rFonts w:ascii="Consolas" w:eastAsia="Times New Roman" w:hAnsi="Consolas" w:cs="Times New Roman"/>
@@ -5900,7 +5762,6 @@
         </w:rPr>
         <w:t xml:space="preserve"> </w:t>
       </w:r>
-      <w:proofErr w:type="gramStart"/>
       <w:r>
         <w:rPr>
           <w:rFonts w:ascii="Consolas" w:eastAsia="Times New Roman" w:hAnsi="Consolas" w:cs="Times New Roman"/>
@@ -5919,18 +5780,7 @@
           <w:szCs w:val="21"/>
           <w:lang w:eastAsia="es-CO"/>
         </w:rPr>
-        <w:t>(</w:t>
-      </w:r>
-      <w:proofErr w:type="gramEnd"/>
-      <w:r>
-        <w:rPr>
-          <w:rFonts w:ascii="Consolas" w:eastAsia="Times New Roman" w:hAnsi="Consolas" w:cs="Times New Roman"/>
-          <w:color w:val="DAD6DA"/>
-          <w:sz w:val="21"/>
-          <w:szCs w:val="21"/>
-          <w:lang w:eastAsia="es-CO"/>
-        </w:rPr>
-        <w:t>) {</w:t>
+        <w:t>() {</w:t>
       </w:r>
     </w:p>
     <w:p>
@@ -5975,7 +5825,6 @@
         </w:rPr>
         <w:t xml:space="preserve"> </w:t>
       </w:r>
-      <w:proofErr w:type="gramStart"/>
       <w:r>
         <w:rPr>
           <w:rFonts w:ascii="Consolas" w:eastAsia="Times New Roman" w:hAnsi="Consolas" w:cs="Times New Roman"/>
@@ -6006,7 +5855,6 @@
         </w:rPr>
         <w:t>ConfiguracionGlobal</w:t>
       </w:r>
-      <w:proofErr w:type="gramEnd"/>
       <w:r>
         <w:rPr>
           <w:rFonts w:ascii="Consolas" w:eastAsia="Times New Roman" w:hAnsi="Consolas" w:cs="Times New Roman"/>
@@ -6082,7 +5930,6 @@
         </w:rPr>
         <w:t xml:space="preserve"> </w:t>
       </w:r>
-      <w:proofErr w:type="gramStart"/>
       <w:r>
         <w:rPr>
           <w:rFonts w:ascii="Consolas" w:eastAsia="Times New Roman" w:hAnsi="Consolas" w:cs="Times New Roman"/>
@@ -6101,18 +5948,7 @@
           <w:szCs w:val="21"/>
           <w:lang w:eastAsia="es-CO"/>
         </w:rPr>
-        <w:t>(</w:t>
-      </w:r>
-      <w:proofErr w:type="gramEnd"/>
-      <w:r>
-        <w:rPr>
-          <w:rFonts w:ascii="Consolas" w:eastAsia="Times New Roman" w:hAnsi="Consolas" w:cs="Times New Roman"/>
-          <w:color w:val="F8F8F2"/>
-          <w:sz w:val="21"/>
-          <w:szCs w:val="21"/>
-          <w:lang w:eastAsia="es-CO"/>
-        </w:rPr>
-        <w:t>)</w:t>
+        <w:t>()</w:t>
       </w:r>
       <w:r>
         <w:rPr>
@@ -6190,7 +6026,6 @@
         </w:rPr>
         <w:t xml:space="preserve"> </w:t>
       </w:r>
-      <w:proofErr w:type="gramStart"/>
       <w:r>
         <w:rPr>
           <w:rFonts w:ascii="Consolas" w:eastAsia="Times New Roman" w:hAnsi="Consolas" w:cs="Times New Roman"/>
@@ -6219,18 +6054,7 @@
           <w:szCs w:val="21"/>
           <w:lang w:eastAsia="es-CO"/>
         </w:rPr>
-        <w:t>#</w:t>
-      </w:r>
-      <w:proofErr w:type="gramEnd"/>
-      <w:r>
-        <w:rPr>
-          <w:rFonts w:ascii="Consolas" w:eastAsia="Times New Roman" w:hAnsi="Consolas" w:cs="Times New Roman"/>
-          <w:color w:val="F8F8F2"/>
-          <w:sz w:val="21"/>
-          <w:szCs w:val="21"/>
-          <w:lang w:eastAsia="es-CO"/>
-        </w:rPr>
-        <w:t>instancia</w:t>
+        <w:t>#instancia</w:t>
       </w:r>
       <w:r>
         <w:rPr>
@@ -6386,7 +6210,6 @@
         </w:rPr>
         <w:t xml:space="preserve"> </w:t>
       </w:r>
-      <w:proofErr w:type="gramStart"/>
       <w:r>
         <w:rPr>
           <w:rFonts w:ascii="Consolas" w:eastAsia="Times New Roman" w:hAnsi="Consolas" w:cs="Times New Roman"/>
@@ -6417,18 +6240,7 @@
           <w:szCs w:val="21"/>
           <w:lang w:eastAsia="es-CO"/>
         </w:rPr>
-        <w:t>#</w:t>
-      </w:r>
-      <w:proofErr w:type="gramEnd"/>
-      <w:r>
-        <w:rPr>
-          <w:rFonts w:ascii="Consolas" w:eastAsia="Times New Roman" w:hAnsi="Consolas" w:cs="Times New Roman"/>
-          <w:color w:val="F8F8F2"/>
-          <w:sz w:val="21"/>
-          <w:szCs w:val="21"/>
-          <w:lang w:eastAsia="es-CO"/>
-        </w:rPr>
-        <w:t>config</w:t>
+        <w:t>#config</w:t>
       </w:r>
       <w:r>
         <w:rPr>
@@ -6522,7 +6334,6 @@
         <w:lastRenderedPageBreak/>
         <w:t xml:space="preserve">  </w:t>
       </w:r>
-      <w:proofErr w:type="gramStart"/>
       <w:r>
         <w:rPr>
           <w:rFonts w:ascii="Consolas" w:eastAsia="Times New Roman" w:hAnsi="Consolas" w:cs="Times New Roman"/>
@@ -6541,18 +6352,7 @@
           <w:szCs w:val="21"/>
           <w:lang w:eastAsia="es-CO"/>
         </w:rPr>
-        <w:t>(</w:t>
-      </w:r>
-      <w:proofErr w:type="gramEnd"/>
-      <w:r>
-        <w:rPr>
-          <w:rFonts w:ascii="Consolas" w:eastAsia="Times New Roman" w:hAnsi="Consolas" w:cs="Times New Roman"/>
-          <w:color w:val="DAD6DA"/>
-          <w:sz w:val="21"/>
-          <w:szCs w:val="21"/>
-          <w:lang w:eastAsia="es-CO"/>
-        </w:rPr>
-        <w:t>) {</w:t>
+        <w:t>() {</w:t>
       </w:r>
     </w:p>
     <w:p>
@@ -6637,7 +6437,6 @@
         </w:rPr>
         <w:t xml:space="preserve"> </w:t>
       </w:r>
-      <w:proofErr w:type="gramStart"/>
       <w:r>
         <w:rPr>
           <w:rFonts w:ascii="Consolas" w:eastAsia="Times New Roman" w:hAnsi="Consolas" w:cs="Times New Roman"/>
@@ -6668,18 +6467,7 @@
           <w:szCs w:val="21"/>
           <w:lang w:eastAsia="es-CO"/>
         </w:rPr>
-        <w:t>#</w:t>
-      </w:r>
-      <w:proofErr w:type="gramEnd"/>
-      <w:r>
-        <w:rPr>
-          <w:rFonts w:ascii="Consolas" w:eastAsia="Times New Roman" w:hAnsi="Consolas" w:cs="Times New Roman"/>
-          <w:color w:val="F8F8F2"/>
-          <w:sz w:val="21"/>
-          <w:szCs w:val="21"/>
-          <w:lang w:eastAsia="es-CO"/>
-        </w:rPr>
-        <w:t>config</w:t>
+        <w:t>#config</w:t>
       </w:r>
       <w:r>
         <w:rPr>
@@ -6742,18 +6530,7 @@
           <w:szCs w:val="21"/>
           <w:lang w:eastAsia="es-CO"/>
         </w:rPr>
-        <w:t>`</w:t>
-      </w:r>
-      <w:proofErr w:type="gramStart"/>
-      <w:r>
-        <w:rPr>
-          <w:rFonts w:ascii="Consolas" w:eastAsia="Times New Roman" w:hAnsi="Consolas" w:cs="Times New Roman"/>
-          <w:color w:val="F1FA8C"/>
-          <w:sz w:val="21"/>
-          <w:szCs w:val="21"/>
-          <w:lang w:eastAsia="es-CO"/>
-        </w:rPr>
-        <w:t>jdbc:postgresql://</w:t>
+        <w:t>`jdbc:postgresql://</w:t>
       </w:r>
       <w:r>
         <w:rPr>
@@ -6763,18 +6540,7 @@
           <w:szCs w:val="21"/>
           <w:lang w:eastAsia="es-CO"/>
         </w:rPr>
-        <w:t>$</w:t>
-      </w:r>
-      <w:proofErr w:type="gramEnd"/>
-      <w:r>
-        <w:rPr>
-          <w:rFonts w:ascii="Consolas" w:eastAsia="Times New Roman" w:hAnsi="Consolas" w:cs="Times New Roman"/>
-          <w:color w:val="FF79C6"/>
-          <w:sz w:val="21"/>
-          <w:szCs w:val="21"/>
-          <w:lang w:eastAsia="es-CO"/>
-        </w:rPr>
-        <w:t>{</w:t>
+        <w:t>${</w:t>
       </w:r>
       <w:r>
         <w:rPr>
@@ -7656,7 +7422,6 @@
         </w:rPr>
         <w:t>0</w:t>
       </w:r>
-      <w:proofErr w:type="gramStart"/>
       <w:r>
         <w:rPr>
           <w:rFonts w:ascii="Consolas" w:eastAsia="Times New Roman" w:hAnsi="Consolas" w:cs="Times New Roman"/>
@@ -7687,7 +7452,6 @@
         </w:rPr>
         <w:t>repeat</w:t>
       </w:r>
-      <w:proofErr w:type="gramEnd"/>
       <w:r>
         <w:rPr>
           <w:rFonts w:ascii="Consolas" w:eastAsia="Times New Roman" w:hAnsi="Consolas" w:cs="Times New Roman"/>
@@ -7764,7 +7528,6 @@
         </w:rPr>
         <w:t xml:space="preserve">  </w:t>
       </w:r>
-      <w:proofErr w:type="gramStart"/>
       <w:r>
         <w:rPr>
           <w:rFonts w:ascii="Consolas" w:eastAsia="Times New Roman" w:hAnsi="Consolas" w:cs="Times New Roman"/>
@@ -7783,18 +7546,7 @@
           <w:szCs w:val="21"/>
           <w:lang w:eastAsia="es-CO"/>
         </w:rPr>
-        <w:t>(</w:t>
-      </w:r>
-      <w:proofErr w:type="gramEnd"/>
-      <w:r>
-        <w:rPr>
-          <w:rFonts w:ascii="Consolas" w:eastAsia="Times New Roman" w:hAnsi="Consolas" w:cs="Times New Roman"/>
-          <w:color w:val="DAD6DA"/>
-          <w:sz w:val="21"/>
-          <w:szCs w:val="21"/>
-          <w:lang w:eastAsia="es-CO"/>
-        </w:rPr>
-        <w:t>) {</w:t>
+        <w:t>() {</w:t>
       </w:r>
     </w:p>
     <w:p>
@@ -7882,7 +7634,6 @@
         </w:rPr>
         <w:t>(</w:t>
       </w:r>
-      <w:proofErr w:type="gramStart"/>
       <w:r>
         <w:rPr>
           <w:rFonts w:ascii="Consolas" w:eastAsia="Times New Roman" w:hAnsi="Consolas" w:cs="Times New Roman"/>
@@ -7911,18 +7662,7 @@
           <w:szCs w:val="21"/>
           <w:lang w:eastAsia="es-CO"/>
         </w:rPr>
-        <w:t>#</w:t>
-      </w:r>
-      <w:proofErr w:type="gramEnd"/>
-      <w:r>
-        <w:rPr>
-          <w:rFonts w:ascii="Consolas" w:eastAsia="Times New Roman" w:hAnsi="Consolas" w:cs="Times New Roman"/>
-          <w:color w:val="F8F8F2"/>
-          <w:sz w:val="21"/>
-          <w:szCs w:val="21"/>
-          <w:lang w:eastAsia="es-CO"/>
-        </w:rPr>
-        <w:t>instancia)</w:t>
+        <w:t>#instancia)</w:t>
       </w:r>
       <w:r>
         <w:rPr>
@@ -7999,7 +7739,6 @@
         </w:rPr>
         <w:t xml:space="preserve"> </w:t>
       </w:r>
-      <w:proofErr w:type="gramStart"/>
       <w:r>
         <w:rPr>
           <w:rFonts w:ascii="Consolas" w:eastAsia="Times New Roman" w:hAnsi="Consolas" w:cs="Times New Roman"/>
@@ -8022,7 +7761,6 @@
         </w:rPr>
         <w:t>(</w:t>
       </w:r>
-      <w:proofErr w:type="gramEnd"/>
       <w:r>
         <w:rPr>
           <w:rFonts w:ascii="Consolas" w:eastAsia="Times New Roman" w:hAnsi="Consolas" w:cs="Times New Roman"/>
@@ -8119,7 +7857,6 @@
         </w:rPr>
         <w:t xml:space="preserve">    </w:t>
       </w:r>
-      <w:proofErr w:type="gramStart"/>
       <w:r>
         <w:rPr>
           <w:rFonts w:ascii="Consolas" w:eastAsia="Times New Roman" w:hAnsi="Consolas" w:cs="Times New Roman"/>
@@ -8148,18 +7885,7 @@
           <w:szCs w:val="21"/>
           <w:lang w:eastAsia="es-CO"/>
         </w:rPr>
-        <w:t>#</w:t>
-      </w:r>
-      <w:proofErr w:type="gramEnd"/>
-      <w:r>
-        <w:rPr>
-          <w:rFonts w:ascii="Consolas" w:eastAsia="Times New Roman" w:hAnsi="Consolas" w:cs="Times New Roman"/>
-          <w:color w:val="F8F8F2"/>
-          <w:sz w:val="21"/>
-          <w:szCs w:val="21"/>
-          <w:lang w:eastAsia="es-CO"/>
-        </w:rPr>
-        <w:t>instancia</w:t>
+        <w:t>#instancia</w:t>
       </w:r>
       <w:r>
         <w:rPr>
@@ -8325,7 +8051,6 @@
         </w:rPr>
         <w:t xml:space="preserve"> </w:t>
       </w:r>
-      <w:proofErr w:type="gramStart"/>
       <w:r>
         <w:rPr>
           <w:rFonts w:ascii="Consolas" w:eastAsia="Times New Roman" w:hAnsi="Consolas" w:cs="Times New Roman"/>
@@ -8344,18 +8069,7 @@
           <w:szCs w:val="21"/>
           <w:lang w:eastAsia="es-CO"/>
         </w:rPr>
-        <w:t>(</w:t>
-      </w:r>
-      <w:proofErr w:type="gramEnd"/>
-      <w:r>
-        <w:rPr>
-          <w:rFonts w:ascii="Consolas" w:eastAsia="Times New Roman" w:hAnsi="Consolas" w:cs="Times New Roman"/>
-          <w:color w:val="DAD6DA"/>
-          <w:sz w:val="21"/>
-          <w:szCs w:val="21"/>
-          <w:lang w:eastAsia="es-CO"/>
-        </w:rPr>
-        <w:t>) {</w:t>
+        <w:t>() {</w:t>
       </w:r>
     </w:p>
     <w:p>
@@ -8401,7 +8115,6 @@
         </w:rPr>
         <w:t xml:space="preserve"> </w:t>
       </w:r>
-      <w:proofErr w:type="gramStart"/>
       <w:r>
         <w:rPr>
           <w:rFonts w:ascii="Consolas" w:eastAsia="Times New Roman" w:hAnsi="Consolas" w:cs="Times New Roman"/>
@@ -8432,7 +8145,6 @@
         </w:rPr>
         <w:t>LoggerCentralizado</w:t>
       </w:r>
-      <w:proofErr w:type="gramEnd"/>
       <w:r>
         <w:rPr>
           <w:rFonts w:ascii="Consolas" w:eastAsia="Times New Roman" w:hAnsi="Consolas" w:cs="Times New Roman"/>
@@ -8508,7 +8220,6 @@
         </w:rPr>
         <w:t xml:space="preserve"> </w:t>
       </w:r>
-      <w:proofErr w:type="gramStart"/>
       <w:r>
         <w:rPr>
           <w:rFonts w:ascii="Consolas" w:eastAsia="Times New Roman" w:hAnsi="Consolas" w:cs="Times New Roman"/>
@@ -8527,18 +8238,7 @@
           <w:szCs w:val="21"/>
           <w:lang w:eastAsia="es-CO"/>
         </w:rPr>
-        <w:t>(</w:t>
-      </w:r>
-      <w:proofErr w:type="gramEnd"/>
-      <w:r>
-        <w:rPr>
-          <w:rFonts w:ascii="Consolas" w:eastAsia="Times New Roman" w:hAnsi="Consolas" w:cs="Times New Roman"/>
-          <w:color w:val="F8F8F2"/>
-          <w:sz w:val="21"/>
-          <w:szCs w:val="21"/>
-          <w:lang w:eastAsia="es-CO"/>
-        </w:rPr>
-        <w:t>)</w:t>
+        <w:t>()</w:t>
       </w:r>
       <w:r>
         <w:rPr>
@@ -8616,7 +8316,6 @@
         </w:rPr>
         <w:t xml:space="preserve"> </w:t>
       </w:r>
-      <w:proofErr w:type="gramStart"/>
       <w:r>
         <w:rPr>
           <w:rFonts w:ascii="Consolas" w:eastAsia="Times New Roman" w:hAnsi="Consolas" w:cs="Times New Roman"/>
@@ -8645,18 +8344,7 @@
           <w:szCs w:val="21"/>
           <w:lang w:eastAsia="es-CO"/>
         </w:rPr>
-        <w:t>#</w:t>
-      </w:r>
-      <w:proofErr w:type="gramEnd"/>
-      <w:r>
-        <w:rPr>
-          <w:rFonts w:ascii="Consolas" w:eastAsia="Times New Roman" w:hAnsi="Consolas" w:cs="Times New Roman"/>
-          <w:color w:val="F8F8F2"/>
-          <w:sz w:val="21"/>
-          <w:szCs w:val="21"/>
-          <w:lang w:eastAsia="es-CO"/>
-        </w:rPr>
-        <w:t>instancia</w:t>
+        <w:t>#instancia</w:t>
       </w:r>
       <w:r>
         <w:rPr>
@@ -8803,7 +8491,6 @@
         </w:rPr>
         <w:t>#</w:t>
       </w:r>
-      <w:proofErr w:type="gramStart"/>
       <w:r>
         <w:rPr>
           <w:rFonts w:ascii="Consolas" w:eastAsia="Times New Roman" w:hAnsi="Consolas" w:cs="Times New Roman"/>
@@ -8824,7 +8511,6 @@
         </w:rPr>
         <w:t>(</w:t>
       </w:r>
-      <w:proofErr w:type="gramEnd"/>
       <w:r>
         <w:rPr>
           <w:rFonts w:ascii="Consolas" w:eastAsia="Times New Roman" w:hAnsi="Consolas" w:cs="Times New Roman"/>
@@ -8870,7 +8556,6 @@
         </w:rPr>
         <w:t xml:space="preserve">    </w:t>
       </w:r>
-      <w:proofErr w:type="gramStart"/>
       <w:r>
         <w:rPr>
           <w:rFonts w:ascii="Consolas" w:eastAsia="Times New Roman" w:hAnsi="Consolas" w:cs="Times New Roman"/>
@@ -8881,7 +8566,6 @@
         </w:rPr>
         <w:t>return</w:t>
       </w:r>
-      <w:proofErr w:type="gramEnd"/>
       <w:r>
         <w:rPr>
           <w:rFonts w:ascii="Consolas" w:eastAsia="Times New Roman" w:hAnsi="Consolas" w:cs="Times New Roman"/>
@@ -9195,7 +8879,6 @@
         </w:rPr>
         <w:t xml:space="preserve">  </w:t>
       </w:r>
-      <w:proofErr w:type="gramStart"/>
       <w:r>
         <w:rPr>
           <w:rFonts w:ascii="Consolas" w:eastAsia="Times New Roman" w:hAnsi="Consolas" w:cs="Times New Roman"/>
@@ -9216,7 +8899,6 @@
         </w:rPr>
         <w:t>(</w:t>
       </w:r>
-      <w:proofErr w:type="gramEnd"/>
       <w:r>
         <w:rPr>
           <w:rFonts w:ascii="Consolas" w:eastAsia="Times New Roman" w:hAnsi="Consolas" w:cs="Times New Roman"/>
@@ -9409,7 +9091,6 @@
         </w:rPr>
         <w:t xml:space="preserve">      </w:t>
       </w:r>
-      <w:proofErr w:type="gramStart"/>
       <w:r>
         <w:rPr>
           <w:rFonts w:ascii="Consolas" w:eastAsia="Times New Roman" w:hAnsi="Consolas" w:cs="Times New Roman"/>
@@ -9420,7 +9101,6 @@
         </w:rPr>
         <w:t>timestamp</w:t>
       </w:r>
-      <w:proofErr w:type="gramEnd"/>
       <w:r>
         <w:rPr>
           <w:rFonts w:ascii="Consolas" w:eastAsia="Times New Roman" w:hAnsi="Consolas" w:cs="Times New Roman"/>
@@ -9538,7 +9218,6 @@
         </w:rPr>
         <w:t xml:space="preserve">      </w:t>
       </w:r>
-      <w:proofErr w:type="gramStart"/>
       <w:r>
         <w:rPr>
           <w:rFonts w:ascii="Consolas" w:eastAsia="Times New Roman" w:hAnsi="Consolas" w:cs="Times New Roman"/>
@@ -9549,7 +9228,6 @@
         </w:rPr>
         <w:t>nivel</w:t>
       </w:r>
-      <w:proofErr w:type="gramEnd"/>
       <w:r>
         <w:rPr>
           <w:rFonts w:ascii="Consolas" w:eastAsia="Times New Roman" w:hAnsi="Consolas" w:cs="Times New Roman"/>
@@ -9699,7 +9377,6 @@
         </w:rPr>
         <w:t xml:space="preserve"> </w:t>
       </w:r>
-      <w:proofErr w:type="gramStart"/>
       <w:r>
         <w:rPr>
           <w:rFonts w:ascii="Consolas" w:eastAsia="Times New Roman" w:hAnsi="Consolas" w:cs="Times New Roman"/>
@@ -9730,18 +9407,7 @@
           <w:szCs w:val="21"/>
           <w:lang w:eastAsia="es-CO"/>
         </w:rPr>
-        <w:t>#</w:t>
-      </w:r>
-      <w:proofErr w:type="gramEnd"/>
-      <w:r>
-        <w:rPr>
-          <w:rFonts w:ascii="Consolas" w:eastAsia="Times New Roman" w:hAnsi="Consolas" w:cs="Times New Roman"/>
-          <w:color w:val="F8F8F2"/>
-          <w:sz w:val="21"/>
-          <w:szCs w:val="21"/>
-          <w:lang w:eastAsia="es-CO"/>
-        </w:rPr>
-        <w:t>ultimoHash</w:t>
+        <w:t>#ultimoHash</w:t>
       </w:r>
       <w:r>
         <w:rPr>
@@ -9809,7 +9475,6 @@
         </w:rPr>
         <w:t xml:space="preserve">    </w:t>
       </w:r>
-      <w:proofErr w:type="gramStart"/>
       <w:r>
         <w:rPr>
           <w:rFonts w:ascii="Consolas" w:eastAsia="Times New Roman" w:hAnsi="Consolas" w:cs="Times New Roman"/>
@@ -9840,7 +9505,6 @@
         </w:rPr>
         <w:t>hash</w:t>
       </w:r>
-      <w:proofErr w:type="gramEnd"/>
       <w:r>
         <w:rPr>
           <w:rFonts w:ascii="Consolas" w:eastAsia="Times New Roman" w:hAnsi="Consolas" w:cs="Times New Roman"/>
@@ -9966,7 +9630,6 @@
         </w:rPr>
         <w:t xml:space="preserve">    </w:t>
       </w:r>
-      <w:proofErr w:type="gramStart"/>
       <w:r>
         <w:rPr>
           <w:rFonts w:ascii="Consolas" w:eastAsia="Times New Roman" w:hAnsi="Consolas" w:cs="Times New Roman"/>
@@ -9997,18 +9660,7 @@
           <w:szCs w:val="21"/>
           <w:lang w:eastAsia="es-CO"/>
         </w:rPr>
-        <w:t>#</w:t>
-      </w:r>
-      <w:proofErr w:type="gramEnd"/>
-      <w:r>
-        <w:rPr>
-          <w:rFonts w:ascii="Consolas" w:eastAsia="Times New Roman" w:hAnsi="Consolas" w:cs="Times New Roman"/>
-          <w:color w:val="F8F8F2"/>
-          <w:sz w:val="21"/>
-          <w:szCs w:val="21"/>
-          <w:lang w:eastAsia="es-CO"/>
-        </w:rPr>
-        <w:t>ultimoHash</w:t>
+        <w:t>#ultimoHash</w:t>
       </w:r>
       <w:r>
         <w:rPr>
@@ -10194,7 +9846,6 @@
         </w:rPr>
         <w:t>this</w:t>
       </w:r>
-      <w:proofErr w:type="gramStart"/>
       <w:r>
         <w:rPr>
           <w:rFonts w:ascii="Consolas" w:eastAsia="Times New Roman" w:hAnsi="Consolas" w:cs="Times New Roman"/>
@@ -10203,18 +9854,7 @@
           <w:szCs w:val="21"/>
           <w:lang w:val="en-US" w:eastAsia="es-CO"/>
         </w:rPr>
-        <w:t>.#</w:t>
-      </w:r>
-      <w:proofErr w:type="gramEnd"/>
-      <w:r>
-        <w:rPr>
-          <w:rFonts w:ascii="Consolas" w:eastAsia="Times New Roman" w:hAnsi="Consolas" w:cs="Times New Roman"/>
-          <w:color w:val="F8F8F2"/>
-          <w:sz w:val="21"/>
-          <w:szCs w:val="21"/>
-          <w:lang w:val="en-US" w:eastAsia="es-CO"/>
-        </w:rPr>
-        <w:t>historial.</w:t>
+        <w:t>.#historial.</w:t>
       </w:r>
       <w:r>
         <w:rPr>
@@ -10404,7 +10044,6 @@
         </w:rPr>
         <w:t>${</w:t>
       </w:r>
-      <w:proofErr w:type="gramStart"/>
       <w:r>
         <w:rPr>
           <w:rFonts w:ascii="Consolas" w:eastAsia="Times New Roman" w:hAnsi="Consolas" w:cs="Times New Roman"/>
@@ -10425,7 +10064,6 @@
         </w:rPr>
         <w:t>.timestamp</w:t>
       </w:r>
-      <w:proofErr w:type="gramEnd"/>
       <w:r>
         <w:rPr>
           <w:rFonts w:ascii="Consolas" w:eastAsia="Times New Roman" w:hAnsi="Consolas" w:cs="Times New Roman"/>
@@ -10593,7 +10231,6 @@
         </w:rPr>
         <w:t xml:space="preserve"> </w:t>
       </w:r>
-      <w:proofErr w:type="gramStart"/>
       <w:r>
         <w:rPr>
           <w:rFonts w:ascii="Consolas" w:eastAsia="Times New Roman" w:hAnsi="Consolas" w:cs="Times New Roman"/>
@@ -10624,7 +10261,6 @@
         </w:rPr>
         <w:t>hash</w:t>
       </w:r>
-      <w:proofErr w:type="gramEnd"/>
       <w:r>
         <w:rPr>
           <w:rFonts w:ascii="Consolas" w:eastAsia="Times New Roman" w:hAnsi="Consolas" w:cs="Times New Roman"/>
@@ -10793,7 +10429,6 @@
         </w:rPr>
         <w:t xml:space="preserve">  </w:t>
       </w:r>
-      <w:proofErr w:type="gramStart"/>
       <w:r>
         <w:rPr>
           <w:rFonts w:ascii="Consolas" w:eastAsia="Times New Roman" w:hAnsi="Consolas" w:cs="Times New Roman"/>
@@ -10814,7 +10449,6 @@
         </w:rPr>
         <w:t>(</w:t>
       </w:r>
-      <w:proofErr w:type="gramEnd"/>
       <w:r>
         <w:rPr>
           <w:rFonts w:ascii="Consolas" w:eastAsia="Times New Roman" w:hAnsi="Consolas" w:cs="Times New Roman"/>
@@ -10902,7 +10536,6 @@
         </w:rPr>
         <w:t xml:space="preserve"> </w:t>
       </w:r>
-      <w:proofErr w:type="gramStart"/>
       <w:r>
         <w:rPr>
           <w:rFonts w:ascii="Consolas" w:eastAsia="Times New Roman" w:hAnsi="Consolas" w:cs="Times New Roman"/>
@@ -10935,7 +10568,6 @@
         </w:rPr>
         <w:t>registrar</w:t>
       </w:r>
-      <w:proofErr w:type="gramEnd"/>
       <w:r>
         <w:rPr>
           <w:rFonts w:ascii="Consolas" w:eastAsia="Times New Roman" w:hAnsi="Consolas" w:cs="Times New Roman"/>
@@ -11214,7 +10846,6 @@
         </w:rPr>
         <w:t xml:space="preserve">  </w:t>
       </w:r>
-      <w:proofErr w:type="gramStart"/>
       <w:r>
         <w:rPr>
           <w:rFonts w:ascii="Consolas" w:eastAsia="Times New Roman" w:hAnsi="Consolas" w:cs="Times New Roman"/>
@@ -11233,18 +10864,7 @@
           <w:szCs w:val="21"/>
           <w:lang w:eastAsia="es-CO"/>
         </w:rPr>
-        <w:t>(</w:t>
-      </w:r>
-      <w:proofErr w:type="gramEnd"/>
-      <w:r>
-        <w:rPr>
-          <w:rFonts w:ascii="Consolas" w:eastAsia="Times New Roman" w:hAnsi="Consolas" w:cs="Times New Roman"/>
-          <w:color w:val="DAD6DA"/>
-          <w:sz w:val="21"/>
-          <w:szCs w:val="21"/>
-          <w:lang w:eastAsia="es-CO"/>
-        </w:rPr>
-        <w:t>) {</w:t>
+        <w:t>() {</w:t>
       </w:r>
     </w:p>
     <w:p>
@@ -11300,7 +10920,6 @@
         </w:rPr>
         <w:t>...</w:t>
       </w:r>
-      <w:proofErr w:type="gramStart"/>
       <w:r>
         <w:rPr>
           <w:rFonts w:ascii="Consolas" w:eastAsia="Times New Roman" w:hAnsi="Consolas" w:cs="Times New Roman"/>
@@ -11331,18 +10950,7 @@
           <w:szCs w:val="21"/>
           <w:lang w:eastAsia="es-CO"/>
         </w:rPr>
-        <w:t>#</w:t>
-      </w:r>
-      <w:proofErr w:type="gramEnd"/>
-      <w:r>
-        <w:rPr>
-          <w:rFonts w:ascii="Consolas" w:eastAsia="Times New Roman" w:hAnsi="Consolas" w:cs="Times New Roman"/>
-          <w:color w:val="F8F8F2"/>
-          <w:sz w:val="21"/>
-          <w:szCs w:val="21"/>
-          <w:lang w:eastAsia="es-CO"/>
-        </w:rPr>
-        <w:t>historial</w:t>
+        <w:t>#historial</w:t>
       </w:r>
       <w:r>
         <w:rPr>
@@ -11464,29 +11072,7 @@
           <w:szCs w:val="21"/>
           <w:lang w:eastAsia="es-CO"/>
         </w:rPr>
-        <w:t xml:space="preserve">// guardada: si alguien alteró una entrada (en memoria o en </w:t>
-      </w:r>
-      <w:proofErr w:type="gramStart"/>
-      <w:r>
-        <w:rPr>
-          <w:rFonts w:ascii="Consolas" w:eastAsia="Times New Roman" w:hAnsi="Consolas" w:cs="Times New Roman"/>
-          <w:color w:val="6272A4"/>
-          <w:sz w:val="21"/>
-          <w:szCs w:val="21"/>
-          <w:lang w:eastAsia="es-CO"/>
-        </w:rPr>
-        <w:t>la BD</w:t>
-      </w:r>
-      <w:proofErr w:type="gramEnd"/>
-      <w:r>
-        <w:rPr>
-          <w:rFonts w:ascii="Consolas" w:eastAsia="Times New Roman" w:hAnsi="Consolas" w:cs="Times New Roman"/>
-          <w:color w:val="6272A4"/>
-          <w:sz w:val="21"/>
-          <w:szCs w:val="21"/>
-          <w:lang w:eastAsia="es-CO"/>
-        </w:rPr>
-        <w:t>),</w:t>
+        <w:t>// guardada: si alguien alteró una entrada (en memoria o en la BD),</w:t>
       </w:r>
     </w:p>
     <w:p>
@@ -11577,7 +11163,6 @@
         </w:rPr>
         <w:t xml:space="preserve">  </w:t>
       </w:r>
-      <w:proofErr w:type="gramStart"/>
       <w:r>
         <w:rPr>
           <w:rFonts w:ascii="Consolas" w:eastAsia="Times New Roman" w:hAnsi="Consolas" w:cs="Times New Roman"/>
@@ -11596,18 +11181,7 @@
           <w:szCs w:val="21"/>
           <w:lang w:val="en-US" w:eastAsia="es-CO"/>
         </w:rPr>
-        <w:t>(</w:t>
-      </w:r>
-      <w:proofErr w:type="gramEnd"/>
-      <w:r>
-        <w:rPr>
-          <w:rFonts w:ascii="Consolas" w:eastAsia="Times New Roman" w:hAnsi="Consolas" w:cs="Times New Roman"/>
-          <w:color w:val="DAD6DA"/>
-          <w:sz w:val="21"/>
-          <w:szCs w:val="21"/>
-          <w:lang w:val="en-US" w:eastAsia="es-CO"/>
-        </w:rPr>
-        <w:t>) {</w:t>
+        <w:t>() {</w:t>
       </w:r>
     </w:p>
     <w:p>
@@ -11632,7 +11206,6 @@
         </w:rPr>
         <w:t xml:space="preserve">    </w:t>
       </w:r>
-      <w:proofErr w:type="gramStart"/>
       <w:r>
         <w:rPr>
           <w:rFonts w:ascii="Consolas" w:eastAsia="Times New Roman" w:hAnsi="Consolas" w:cs="Times New Roman"/>
@@ -11643,7 +11216,6 @@
         </w:rPr>
         <w:t>let</w:t>
       </w:r>
-      <w:proofErr w:type="gramEnd"/>
       <w:r>
         <w:rPr>
           <w:rFonts w:ascii="Consolas" w:eastAsia="Times New Roman" w:hAnsi="Consolas" w:cs="Times New Roman"/>
@@ -11807,7 +11379,6 @@
         </w:rPr>
         <w:t xml:space="preserve">    </w:t>
       </w:r>
-      <w:proofErr w:type="gramStart"/>
       <w:r>
         <w:rPr>
           <w:rFonts w:ascii="Consolas" w:eastAsia="Times New Roman" w:hAnsi="Consolas" w:cs="Times New Roman"/>
@@ -11818,7 +11389,6 @@
         </w:rPr>
         <w:t>for</w:t>
       </w:r>
-      <w:proofErr w:type="gramEnd"/>
       <w:r>
         <w:rPr>
           <w:rFonts w:ascii="Consolas" w:eastAsia="Times New Roman" w:hAnsi="Consolas" w:cs="Times New Roman"/>
@@ -11964,7 +11534,6 @@
         </w:rPr>
         <w:t xml:space="preserve">      </w:t>
       </w:r>
-      <w:proofErr w:type="gramStart"/>
       <w:r>
         <w:rPr>
           <w:rFonts w:ascii="Consolas" w:eastAsia="Times New Roman" w:hAnsi="Consolas" w:cs="Times New Roman"/>
@@ -11975,7 +11544,6 @@
         </w:rPr>
         <w:t>const</w:t>
       </w:r>
-      <w:proofErr w:type="gramEnd"/>
       <w:r>
         <w:rPr>
           <w:rFonts w:ascii="Consolas" w:eastAsia="Times New Roman" w:hAnsi="Consolas" w:cs="Times New Roman"/>
@@ -12099,7 +11667,6 @@
         </w:rPr>
         <w:t xml:space="preserve">      </w:t>
       </w:r>
-      <w:proofErr w:type="gramStart"/>
       <w:r>
         <w:rPr>
           <w:rFonts w:ascii="Consolas" w:eastAsia="Times New Roman" w:hAnsi="Consolas" w:cs="Times New Roman"/>
@@ -12110,7 +11677,6 @@
         </w:rPr>
         <w:t>const</w:t>
       </w:r>
-      <w:proofErr w:type="gramEnd"/>
       <w:r>
         <w:rPr>
           <w:rFonts w:ascii="Consolas" w:eastAsia="Times New Roman" w:hAnsi="Consolas" w:cs="Times New Roman"/>
@@ -12336,7 +11902,6 @@
         </w:rPr>
         <w:t xml:space="preserve">      </w:t>
       </w:r>
-      <w:proofErr w:type="gramStart"/>
       <w:r>
         <w:rPr>
           <w:rFonts w:ascii="Consolas" w:eastAsia="Times New Roman" w:hAnsi="Consolas" w:cs="Times New Roman"/>
@@ -12347,7 +11912,6 @@
         </w:rPr>
         <w:t>if</w:t>
       </w:r>
-      <w:proofErr w:type="gramEnd"/>
       <w:r>
         <w:rPr>
           <w:rFonts w:ascii="Consolas" w:eastAsia="Times New Roman" w:hAnsi="Consolas" w:cs="Times New Roman"/>
@@ -12501,7 +12065,6 @@
         </w:rPr>
         <w:t xml:space="preserve">      </w:t>
       </w:r>
-      <w:proofErr w:type="gramStart"/>
       <w:r>
         <w:rPr>
           <w:rFonts w:ascii="Consolas" w:eastAsia="Times New Roman" w:hAnsi="Consolas" w:cs="Times New Roman"/>
@@ -12512,7 +12075,6 @@
         </w:rPr>
         <w:t>hashPrevio</w:t>
       </w:r>
-      <w:proofErr w:type="gramEnd"/>
       <w:r>
         <w:rPr>
           <w:rFonts w:ascii="Consolas" w:eastAsia="Times New Roman" w:hAnsi="Consolas" w:cs="Times New Roman"/>
@@ -12609,7 +12171,6 @@
         </w:rPr>
         <w:t xml:space="preserve">    </w:t>
       </w:r>
-      <w:proofErr w:type="gramStart"/>
       <w:r>
         <w:rPr>
           <w:rFonts w:ascii="Consolas" w:eastAsia="Times New Roman" w:hAnsi="Consolas" w:cs="Times New Roman"/>
@@ -12620,7 +12181,6 @@
         </w:rPr>
         <w:t>return</w:t>
       </w:r>
-      <w:proofErr w:type="gramEnd"/>
       <w:r>
         <w:rPr>
           <w:rFonts w:ascii="Consolas" w:eastAsia="Times New Roman" w:hAnsi="Consolas" w:cs="Times New Roman"/>
@@ -13381,7 +12941,6 @@
         </w:rPr>
         <w:t xml:space="preserve">  </w:t>
       </w:r>
-      <w:proofErr w:type="gramStart"/>
       <w:r>
         <w:rPr>
           <w:rFonts w:ascii="Consolas" w:eastAsia="Times New Roman" w:hAnsi="Consolas" w:cs="Times New Roman"/>
@@ -13400,18 +12959,7 @@
           <w:szCs w:val="21"/>
           <w:lang w:eastAsia="es-CO"/>
         </w:rPr>
-        <w:t>(</w:t>
-      </w:r>
-      <w:proofErr w:type="gramEnd"/>
-      <w:r>
-        <w:rPr>
-          <w:rFonts w:ascii="Consolas" w:eastAsia="Times New Roman" w:hAnsi="Consolas" w:cs="Times New Roman"/>
-          <w:color w:val="DAD6DA"/>
-          <w:sz w:val="21"/>
-          <w:szCs w:val="21"/>
-          <w:lang w:eastAsia="es-CO"/>
-        </w:rPr>
-        <w:t>) {</w:t>
+        <w:t>() {</w:t>
       </w:r>
     </w:p>
     <w:p>
@@ -13500,7 +13048,6 @@
         </w:rPr>
         <w:t>(</w:t>
       </w:r>
-      <w:proofErr w:type="gramStart"/>
       <w:r>
         <w:rPr>
           <w:rFonts w:ascii="Consolas" w:eastAsia="Times New Roman" w:hAnsi="Consolas" w:cs="Times New Roman"/>
@@ -13529,18 +13076,7 @@
           <w:szCs w:val="21"/>
           <w:lang w:eastAsia="es-CO"/>
         </w:rPr>
-        <w:t>#</w:t>
-      </w:r>
-      <w:proofErr w:type="gramEnd"/>
-      <w:r>
-        <w:rPr>
-          <w:rFonts w:ascii="Consolas" w:eastAsia="Times New Roman" w:hAnsi="Consolas" w:cs="Times New Roman"/>
-          <w:color w:val="F8F8F2"/>
-          <w:sz w:val="21"/>
-          <w:szCs w:val="21"/>
-          <w:lang w:eastAsia="es-CO"/>
-        </w:rPr>
-        <w:t>instancia)</w:t>
+        <w:t>#instancia)</w:t>
       </w:r>
       <w:r>
         <w:rPr>
@@ -13617,7 +13153,6 @@
         </w:rPr>
         <w:t xml:space="preserve"> </w:t>
       </w:r>
-      <w:proofErr w:type="gramStart"/>
       <w:r>
         <w:rPr>
           <w:rFonts w:ascii="Consolas" w:eastAsia="Times New Roman" w:hAnsi="Consolas" w:cs="Times New Roman"/>
@@ -13640,7 +13175,6 @@
         </w:rPr>
         <w:t>(</w:t>
       </w:r>
-      <w:proofErr w:type="gramEnd"/>
       <w:r>
         <w:rPr>
           <w:rFonts w:ascii="Consolas" w:eastAsia="Times New Roman" w:hAnsi="Consolas" w:cs="Times New Roman"/>
@@ -13936,7 +13470,6 @@
         </w:rPr>
         <w:t xml:space="preserve">    </w:t>
       </w:r>
-      <w:proofErr w:type="gramStart"/>
       <w:r>
         <w:rPr>
           <w:rFonts w:ascii="Consolas" w:eastAsia="Times New Roman" w:hAnsi="Consolas" w:cs="Times New Roman"/>
@@ -13967,18 +13500,7 @@
           <w:szCs w:val="21"/>
           <w:lang w:eastAsia="es-CO"/>
         </w:rPr>
-        <w:t>#</w:t>
-      </w:r>
-      <w:proofErr w:type="gramEnd"/>
-      <w:r>
-        <w:rPr>
-          <w:rFonts w:ascii="Consolas" w:eastAsia="Times New Roman" w:hAnsi="Consolas" w:cs="Times New Roman"/>
-          <w:color w:val="F8F8F2"/>
-          <w:sz w:val="21"/>
-          <w:szCs w:val="21"/>
-          <w:lang w:eastAsia="es-CO"/>
-        </w:rPr>
-        <w:t>maxConexiones</w:t>
+        <w:t>#maxConexiones</w:t>
       </w:r>
       <w:r>
         <w:rPr>
@@ -14123,7 +13645,6 @@
         </w:rPr>
         <w:t xml:space="preserve">    </w:t>
       </w:r>
-      <w:proofErr w:type="gramStart"/>
       <w:r>
         <w:rPr>
           <w:rFonts w:ascii="Consolas" w:eastAsia="Times New Roman" w:hAnsi="Consolas" w:cs="Times New Roman"/>
@@ -14152,18 +13673,7 @@
           <w:szCs w:val="21"/>
           <w:lang w:eastAsia="es-CO"/>
         </w:rPr>
-        <w:t>#</w:t>
-      </w:r>
-      <w:proofErr w:type="gramEnd"/>
-      <w:r>
-        <w:rPr>
-          <w:rFonts w:ascii="Consolas" w:eastAsia="Times New Roman" w:hAnsi="Consolas" w:cs="Times New Roman"/>
-          <w:color w:val="F8F8F2"/>
-          <w:sz w:val="21"/>
-          <w:szCs w:val="21"/>
-          <w:lang w:eastAsia="es-CO"/>
-        </w:rPr>
-        <w:t>instancia</w:t>
+        <w:t>#instancia</w:t>
       </w:r>
       <w:r>
         <w:rPr>
@@ -14309,7 +13819,6 @@
         </w:rPr>
         <w:t xml:space="preserve">  </w:t>
       </w:r>
-      <w:proofErr w:type="gramStart"/>
       <w:r>
         <w:rPr>
           <w:rFonts w:ascii="Consolas" w:eastAsia="Times New Roman" w:hAnsi="Consolas" w:cs="Times New Roman"/>
@@ -14320,7 +13829,6 @@
         </w:rPr>
         <w:t>static</w:t>
       </w:r>
-      <w:proofErr w:type="gramEnd"/>
       <w:r>
         <w:rPr>
           <w:rFonts w:ascii="Consolas" w:eastAsia="Times New Roman" w:hAnsi="Consolas" w:cs="Times New Roman"/>
@@ -14374,7 +13882,6 @@
         </w:rPr>
         <w:t xml:space="preserve">    </w:t>
       </w:r>
-      <w:proofErr w:type="gramStart"/>
       <w:r>
         <w:rPr>
           <w:rFonts w:ascii="Consolas" w:eastAsia="Times New Roman" w:hAnsi="Consolas" w:cs="Times New Roman"/>
@@ -14385,7 +13892,6 @@
         </w:rPr>
         <w:t>if</w:t>
       </w:r>
-      <w:proofErr w:type="gramEnd"/>
       <w:r>
         <w:rPr>
           <w:rFonts w:ascii="Consolas" w:eastAsia="Times New Roman" w:hAnsi="Consolas" w:cs="Times New Roman"/>
@@ -14479,7 +13985,6 @@
         </w:rPr>
         <w:t xml:space="preserve">      </w:t>
       </w:r>
-      <w:proofErr w:type="gramStart"/>
       <w:r>
         <w:rPr>
           <w:rFonts w:ascii="Consolas" w:eastAsia="Times New Roman" w:hAnsi="Consolas" w:cs="Times New Roman"/>
@@ -14492,7 +13997,6 @@
         </w:rPr>
         <w:t>new</w:t>
       </w:r>
-      <w:proofErr w:type="gramEnd"/>
       <w:r>
         <w:rPr>
           <w:rFonts w:ascii="Consolas" w:eastAsia="Times New Roman" w:hAnsi="Consolas" w:cs="Times New Roman"/>
@@ -14579,7 +14083,6 @@
         </w:rPr>
         <w:t xml:space="preserve">    </w:t>
       </w:r>
-      <w:proofErr w:type="gramStart"/>
       <w:r>
         <w:rPr>
           <w:rFonts w:ascii="Consolas" w:eastAsia="Times New Roman" w:hAnsi="Consolas" w:cs="Times New Roman"/>
@@ -14590,7 +14093,6 @@
         </w:rPr>
         <w:t>return</w:t>
       </w:r>
-      <w:proofErr w:type="gramEnd"/>
       <w:r>
         <w:rPr>
           <w:rFonts w:ascii="Consolas" w:eastAsia="Times New Roman" w:hAnsi="Consolas" w:cs="Times New Roman"/>
@@ -14730,7 +14232,6 @@
         </w:rPr>
         <w:t xml:space="preserve"> </w:t>
       </w:r>
-      <w:proofErr w:type="gramStart"/>
       <w:r>
         <w:rPr>
           <w:rFonts w:ascii="Consolas" w:eastAsia="Times New Roman" w:hAnsi="Consolas" w:cs="Times New Roman"/>
@@ -14749,18 +14250,7 @@
           <w:szCs w:val="21"/>
           <w:lang w:eastAsia="es-CO"/>
         </w:rPr>
-        <w:t>(</w:t>
-      </w:r>
-      <w:proofErr w:type="gramEnd"/>
-      <w:r>
-        <w:rPr>
-          <w:rFonts w:ascii="Consolas" w:eastAsia="Times New Roman" w:hAnsi="Consolas" w:cs="Times New Roman"/>
-          <w:color w:val="DAD6DA"/>
-          <w:sz w:val="21"/>
-          <w:szCs w:val="21"/>
-          <w:lang w:eastAsia="es-CO"/>
-        </w:rPr>
-        <w:t>) {</w:t>
+        <w:t>() {</w:t>
       </w:r>
     </w:p>
     <w:p>
@@ -14997,7 +14487,6 @@
         </w:rPr>
         <w:t xml:space="preserve">    </w:t>
       </w:r>
-      <w:proofErr w:type="gramStart"/>
       <w:r>
         <w:rPr>
           <w:rFonts w:ascii="Consolas" w:eastAsia="Times New Roman" w:hAnsi="Consolas" w:cs="Times New Roman"/>
@@ -15008,7 +14497,6 @@
         </w:rPr>
         <w:t>if</w:t>
       </w:r>
-      <w:proofErr w:type="gramEnd"/>
       <w:r>
         <w:rPr>
           <w:rFonts w:ascii="Consolas" w:eastAsia="Times New Roman" w:hAnsi="Consolas" w:cs="Times New Roman"/>
@@ -15156,7 +14644,6 @@
         </w:rPr>
         <w:t xml:space="preserve">      </w:t>
       </w:r>
-      <w:proofErr w:type="gramStart"/>
       <w:r>
         <w:rPr>
           <w:rFonts w:ascii="Consolas" w:eastAsia="Times New Roman" w:hAnsi="Consolas" w:cs="Times New Roman"/>
@@ -15187,7 +14674,6 @@
         </w:rPr>
         <w:t>registrar</w:t>
       </w:r>
-      <w:proofErr w:type="gramEnd"/>
       <w:r>
         <w:rPr>
           <w:rFonts w:ascii="Consolas" w:eastAsia="Times New Roman" w:hAnsi="Consolas" w:cs="Times New Roman"/>
@@ -15311,7 +14797,6 @@
         </w:rPr>
         <w:t xml:space="preserve">      </w:t>
       </w:r>
-      <w:proofErr w:type="gramStart"/>
       <w:r>
         <w:rPr>
           <w:rFonts w:ascii="Consolas" w:eastAsia="Times New Roman" w:hAnsi="Consolas" w:cs="Times New Roman"/>
@@ -15322,7 +14807,6 @@
         </w:rPr>
         <w:t>await</w:t>
       </w:r>
-      <w:proofErr w:type="gramEnd"/>
       <w:r>
         <w:rPr>
           <w:rFonts w:ascii="Consolas" w:eastAsia="Times New Roman" w:hAnsi="Consolas" w:cs="Times New Roman"/>
@@ -15570,7 +15054,6 @@
         </w:rPr>
         <w:t xml:space="preserve">    </w:t>
       </w:r>
-      <w:proofErr w:type="gramStart"/>
       <w:r>
         <w:rPr>
           <w:rFonts w:ascii="Consolas" w:eastAsia="Times New Roman" w:hAnsi="Consolas" w:cs="Times New Roman"/>
@@ -15601,18 +15084,7 @@
           <w:szCs w:val="21"/>
           <w:lang w:eastAsia="es-CO"/>
         </w:rPr>
-        <w:t>#</w:t>
-      </w:r>
-      <w:proofErr w:type="gramEnd"/>
-      <w:r>
-        <w:rPr>
-          <w:rFonts w:ascii="Consolas" w:eastAsia="Times New Roman" w:hAnsi="Consolas" w:cs="Times New Roman"/>
-          <w:color w:val="F8F8F2"/>
-          <w:sz w:val="21"/>
-          <w:szCs w:val="21"/>
-          <w:lang w:eastAsia="es-CO"/>
-        </w:rPr>
-        <w:t>conexionesActivas</w:t>
+        <w:t>#conexionesActivas</w:t>
       </w:r>
       <w:r>
         <w:rPr>
@@ -15657,7 +15129,6 @@
         </w:rPr>
         <w:t xml:space="preserve">    </w:t>
       </w:r>
-      <w:proofErr w:type="gramStart"/>
       <w:r>
         <w:rPr>
           <w:rFonts w:ascii="Consolas" w:eastAsia="Times New Roman" w:hAnsi="Consolas" w:cs="Times New Roman"/>
@@ -15688,7 +15159,6 @@
         </w:rPr>
         <w:t>registrar</w:t>
       </w:r>
-      <w:proofErr w:type="gramEnd"/>
       <w:r>
         <w:rPr>
           <w:rFonts w:ascii="Consolas" w:eastAsia="Times New Roman" w:hAnsi="Consolas" w:cs="Times New Roman"/>
@@ -15805,7 +15275,6 @@
         </w:rPr>
         <w:t>${</w:t>
       </w:r>
-      <w:proofErr w:type="gramStart"/>
       <w:r>
         <w:rPr>
           <w:rFonts w:ascii="Consolas" w:eastAsia="Times New Roman" w:hAnsi="Consolas" w:cs="Times New Roman"/>
@@ -15826,18 +15295,7 @@
           <w:szCs w:val="21"/>
           <w:lang w:eastAsia="es-CO"/>
         </w:rPr>
-        <w:t>.#</w:t>
-      </w:r>
-      <w:proofErr w:type="gramEnd"/>
-      <w:r>
-        <w:rPr>
-          <w:rFonts w:ascii="Consolas" w:eastAsia="Times New Roman" w:hAnsi="Consolas" w:cs="Times New Roman"/>
-          <w:color w:val="F8F8F2"/>
-          <w:sz w:val="21"/>
-          <w:szCs w:val="21"/>
-          <w:lang w:eastAsia="es-CO"/>
-        </w:rPr>
-        <w:t>conexionesActivas</w:t>
+        <w:t>.#conexionesActivas</w:t>
       </w:r>
       <w:r>
         <w:rPr>
@@ -15990,7 +15448,6 @@
         </w:rPr>
         <w:t xml:space="preserve">    </w:t>
       </w:r>
-      <w:proofErr w:type="gramStart"/>
       <w:r>
         <w:rPr>
           <w:rFonts w:ascii="Consolas" w:eastAsia="Times New Roman" w:hAnsi="Consolas" w:cs="Times New Roman"/>
@@ -16001,7 +15458,6 @@
         </w:rPr>
         <w:t>return</w:t>
       </w:r>
-      <w:proofErr w:type="gramEnd"/>
       <w:r>
         <w:rPr>
           <w:rFonts w:ascii="Consolas" w:eastAsia="Times New Roman" w:hAnsi="Consolas" w:cs="Times New Roman"/>
@@ -16035,7 +15491,6 @@
         </w:rPr>
         <w:t xml:space="preserve">      </w:t>
       </w:r>
-      <w:proofErr w:type="gramStart"/>
       <w:r>
         <w:rPr>
           <w:rFonts w:ascii="Consolas" w:eastAsia="Times New Roman" w:hAnsi="Consolas" w:cs="Times New Roman"/>
@@ -16046,7 +15501,6 @@
         </w:rPr>
         <w:t>id</w:t>
       </w:r>
-      <w:proofErr w:type="gramEnd"/>
       <w:r>
         <w:rPr>
           <w:rFonts w:ascii="Consolas" w:eastAsia="Times New Roman" w:hAnsi="Consolas" w:cs="Times New Roman"/>
@@ -16142,7 +15596,6 @@
         </w:rPr>
         <w:t xml:space="preserve">      </w:t>
       </w:r>
-      <w:proofErr w:type="gramStart"/>
       <w:r>
         <w:rPr>
           <w:rFonts w:ascii="Consolas" w:eastAsia="Times New Roman" w:hAnsi="Consolas" w:cs="Times New Roman"/>
@@ -16153,7 +15606,6 @@
         </w:rPr>
         <w:t>liberar</w:t>
       </w:r>
-      <w:proofErr w:type="gramEnd"/>
       <w:r>
         <w:rPr>
           <w:rFonts w:ascii="Consolas" w:eastAsia="Times New Roman" w:hAnsi="Consolas" w:cs="Times New Roman"/>
@@ -16338,7 +15790,6 @@
         </w:rPr>
         <w:t>  #</w:t>
       </w:r>
-      <w:proofErr w:type="gramStart"/>
       <w:r>
         <w:rPr>
           <w:rFonts w:ascii="Consolas" w:eastAsia="Times New Roman" w:hAnsi="Consolas" w:cs="Times New Roman"/>
@@ -16357,18 +15808,7 @@
           <w:szCs w:val="21"/>
           <w:lang w:eastAsia="es-CO"/>
         </w:rPr>
-        <w:t>(</w:t>
-      </w:r>
-      <w:proofErr w:type="gramEnd"/>
-      <w:r>
-        <w:rPr>
-          <w:rFonts w:ascii="Consolas" w:eastAsia="Times New Roman" w:hAnsi="Consolas" w:cs="Times New Roman"/>
-          <w:color w:val="DAD6DA"/>
-          <w:sz w:val="21"/>
-          <w:szCs w:val="21"/>
-          <w:lang w:eastAsia="es-CO"/>
-        </w:rPr>
-        <w:t>) {</w:t>
+        <w:t>() {</w:t>
       </w:r>
     </w:p>
     <w:p>
@@ -16393,7 +15833,6 @@
         </w:rPr>
         <w:t xml:space="preserve">    </w:t>
       </w:r>
-      <w:proofErr w:type="gramStart"/>
       <w:r>
         <w:rPr>
           <w:rFonts w:ascii="Consolas" w:eastAsia="Times New Roman" w:hAnsi="Consolas" w:cs="Times New Roman"/>
@@ -16424,18 +15863,7 @@
           <w:szCs w:val="21"/>
           <w:lang w:eastAsia="es-CO"/>
         </w:rPr>
-        <w:t>#</w:t>
-      </w:r>
-      <w:proofErr w:type="gramEnd"/>
-      <w:r>
-        <w:rPr>
-          <w:rFonts w:ascii="Consolas" w:eastAsia="Times New Roman" w:hAnsi="Consolas" w:cs="Times New Roman"/>
-          <w:color w:val="F8F8F2"/>
-          <w:sz w:val="21"/>
-          <w:szCs w:val="21"/>
-          <w:lang w:eastAsia="es-CO"/>
-        </w:rPr>
-        <w:t>conexionesActivas</w:t>
+        <w:t>#conexionesActivas</w:t>
       </w:r>
       <w:r>
         <w:rPr>
@@ -16607,7 +16035,6 @@
         </w:rPr>
         <w:t xml:space="preserve"> </w:t>
       </w:r>
-      <w:proofErr w:type="gramStart"/>
       <w:r>
         <w:rPr>
           <w:rFonts w:ascii="Consolas" w:eastAsia="Times New Roman" w:hAnsi="Consolas" w:cs="Times New Roman"/>
@@ -16628,18 +16055,7 @@
           <w:szCs w:val="21"/>
           <w:lang w:eastAsia="es-CO"/>
         </w:rPr>
-        <w:t>.#</w:t>
-      </w:r>
-      <w:proofErr w:type="gramEnd"/>
-      <w:r>
-        <w:rPr>
-          <w:rFonts w:ascii="Consolas" w:eastAsia="Times New Roman" w:hAnsi="Consolas" w:cs="Times New Roman"/>
-          <w:color w:val="F8F8F2"/>
-          <w:sz w:val="21"/>
-          <w:szCs w:val="21"/>
-          <w:lang w:eastAsia="es-CO"/>
-        </w:rPr>
-        <w:t>colaEspera.</w:t>
+        <w:t>.#colaEspera.</w:t>
       </w:r>
       <w:r>
         <w:rPr>
@@ -16754,7 +16170,6 @@
         </w:rPr>
         <w:t xml:space="preserve"> </w:t>
       </w:r>
-      <w:proofErr w:type="gramStart"/>
       <w:r>
         <w:rPr>
           <w:rFonts w:ascii="Consolas" w:eastAsia="Times New Roman" w:hAnsi="Consolas" w:cs="Times New Roman"/>
@@ -16773,18 +16188,7 @@
           <w:szCs w:val="21"/>
           <w:lang w:eastAsia="es-CO"/>
         </w:rPr>
-        <w:t>(</w:t>
-      </w:r>
-      <w:proofErr w:type="gramEnd"/>
-      <w:r>
-        <w:rPr>
-          <w:rFonts w:ascii="Consolas" w:eastAsia="Times New Roman" w:hAnsi="Consolas" w:cs="Times New Roman"/>
-          <w:color w:val="F8F8F2"/>
-          <w:sz w:val="21"/>
-          <w:szCs w:val="21"/>
-          <w:lang w:eastAsia="es-CO"/>
-        </w:rPr>
-        <w:t>)</w:t>
+        <w:t>()</w:t>
       </w:r>
       <w:r>
         <w:rPr>
@@ -16875,7 +16279,6 @@
         </w:rPr>
         <w:t xml:space="preserve"> </w:t>
       </w:r>
-      <w:proofErr w:type="gramStart"/>
       <w:r>
         <w:rPr>
           <w:rFonts w:ascii="Consolas" w:eastAsia="Times New Roman" w:hAnsi="Consolas" w:cs="Times New Roman"/>
@@ -16894,18 +16297,7 @@
           <w:szCs w:val="21"/>
           <w:lang w:eastAsia="es-CO"/>
         </w:rPr>
-        <w:t>(</w:t>
-      </w:r>
-      <w:proofErr w:type="gramEnd"/>
-      <w:r>
-        <w:rPr>
-          <w:rFonts w:ascii="Consolas" w:eastAsia="Times New Roman" w:hAnsi="Consolas" w:cs="Times New Roman"/>
-          <w:color w:val="DAD6DA"/>
-          <w:sz w:val="21"/>
-          <w:szCs w:val="21"/>
-          <w:lang w:eastAsia="es-CO"/>
-        </w:rPr>
-        <w:t>) {</w:t>
+        <w:t>() {</w:t>
       </w:r>
     </w:p>
     <w:p>
@@ -16950,7 +16342,6 @@
         </w:rPr>
         <w:t xml:space="preserve"> </w:t>
       </w:r>
-      <w:proofErr w:type="gramStart"/>
       <w:r>
         <w:rPr>
           <w:rFonts w:ascii="Consolas" w:eastAsia="Times New Roman" w:hAnsi="Consolas" w:cs="Times New Roman"/>
@@ -16981,18 +16372,7 @@
           <w:szCs w:val="21"/>
           <w:lang w:eastAsia="es-CO"/>
         </w:rPr>
-        <w:t>#</w:t>
-      </w:r>
-      <w:proofErr w:type="gramEnd"/>
-      <w:r>
-        <w:rPr>
-          <w:rFonts w:ascii="Consolas" w:eastAsia="Times New Roman" w:hAnsi="Consolas" w:cs="Times New Roman"/>
-          <w:color w:val="F8F8F2"/>
-          <w:sz w:val="21"/>
-          <w:szCs w:val="21"/>
-          <w:lang w:eastAsia="es-CO"/>
-        </w:rPr>
-        <w:t>conexionesActivas</w:t>
+        <w:t>#conexionesActivas</w:t>
       </w:r>
       <w:r>
         <w:rPr>
@@ -17126,19 +16506,11 @@
           <w:rFonts w:ascii="Times New Roman" w:hAnsi="Times New Roman" w:cs="Times New Roman"/>
         </w:rPr>
       </w:pPr>
-      <w:proofErr w:type="gramStart"/>
-      <w:r>
-        <w:rPr>
-          <w:rFonts w:ascii="Times New Roman" w:hAnsi="Times New Roman" w:cs="Times New Roman"/>
-        </w:rPr>
-        <w:t>Para  SecureBallot</w:t>
-      </w:r>
-      <w:proofErr w:type="gramEnd"/>
-      <w:r>
-        <w:rPr>
-          <w:rFonts w:ascii="Times New Roman" w:hAnsi="Times New Roman" w:cs="Times New Roman"/>
-        </w:rPr>
-        <w:t xml:space="preserve"> apliqué Singleton en tres partes: ConfiguracionGlobal, LoggerCentralizado y PoolConexionesDB. Elegí estas tres porque en un sistema de votación no puede haber "varias versiones" de ellas funcionando a la vez, eso genera problemas.</w:t>
+      <w:r>
+        <w:rPr>
+          <w:rFonts w:ascii="Times New Roman" w:hAnsi="Times New Roman" w:cs="Times New Roman"/>
+        </w:rPr>
+        <w:t>Para  SecureBallot apliqué Singleton en tres partes: ConfiguracionGlobal, LoggerCentralizado y PoolConexionesDB. Elegí estas tres porque en un sistema de votación no puede haber "varias versiones" de ellas funcionando a la vez, eso genera problemas.</w:t>
       </w:r>
     </w:p>
     <w:p>
@@ -17162,21 +16534,7 @@
         <w:rPr>
           <w:rFonts w:ascii="Times New Roman" w:hAnsi="Times New Roman" w:cs="Times New Roman"/>
         </w:rPr>
-        <w:t xml:space="preserve">ConfiguracionGlobal es la más simple de explicar. Si cada parte del sistema (login, conteo, auditoría) tuviera su propia copia de la config —host </w:t>
-      </w:r>
-      <w:proofErr w:type="gramStart"/>
-      <w:r>
-        <w:rPr>
-          <w:rFonts w:ascii="Times New Roman" w:hAnsi="Times New Roman" w:cs="Times New Roman"/>
-        </w:rPr>
-        <w:t>de la BD</w:t>
-      </w:r>
-      <w:proofErr w:type="gramEnd"/>
-      <w:r>
-        <w:rPr>
-          <w:rFonts w:ascii="Times New Roman" w:hAnsi="Times New Roman" w:cs="Times New Roman"/>
-        </w:rPr>
-        <w:t>, api keys, etc—, en algún momento una copia queda vieja y ya empieza el desorden, porque un módulo estaría usando datos distintos a otro sin que nadie se dé cuenta. Con Singleton hay una sola copia y todos leen de ahí.</w:t>
+        <w:t>ConfiguracionGlobal es la más simple de explicar. Si cada parte del sistema (login, conteo, auditoría) tuviera su propia copia de la config —host de la BD, api keys, etc—, en algún momento una copia queda vieja y ya empieza el desorden, porque un módulo estaría usando datos distintos a otro sin que nadie se dé cuenta. Con Singleton hay una sola copia y todos leen de ahí.</w:t>
       </w:r>
     </w:p>
     <w:p>
@@ -17200,21 +16558,7 @@
         <w:rPr>
           <w:rFonts w:ascii="Times New Roman" w:hAnsi="Times New Roman" w:cs="Times New Roman"/>
         </w:rPr>
-        <w:t xml:space="preserve">Con LoggerCentralizado la cosa es más delicada. Una plataforma de votación necesita poder mostrar qué pasó durante el proceso si alguien lo pide. Si hubiera varios loggers al mismo tiempo, el historial quedaría partido en pedazos y ya no se podría confiar en el orden real de los eventos. Por eso además de ser Singleton, cada registro guarda el hash del registro anterior (hashAnterior -&gt; hash), entonces si alguien edita algo después la cadena deja de cuadrar y </w:t>
-      </w:r>
-      <w:proofErr w:type="gramStart"/>
-      <w:r>
-        <w:rPr>
-          <w:rFonts w:ascii="Times New Roman" w:hAnsi="Times New Roman" w:cs="Times New Roman"/>
-        </w:rPr>
-        <w:t>verificarIntegridad(</w:t>
-      </w:r>
-      <w:proofErr w:type="gramEnd"/>
-      <w:r>
-        <w:rPr>
-          <w:rFonts w:ascii="Times New Roman" w:hAnsi="Times New Roman" w:cs="Times New Roman"/>
-        </w:rPr>
-        <w:t>) lo agarra. Esto es literal lo que pide el proyecto en la parte de auditoría.</w:t>
+        <w:t>Con LoggerCentralizado la cosa es más delicada. Una plataforma de votación necesita poder mostrar qué pasó durante el proceso si alguien lo pide. Si hubiera varios loggers al mismo tiempo, el historial quedaría partido en pedazos y ya no se podría confiar en el orden real de los eventos. Por eso además de ser Singleton, cada registro guarda el hash del registro anterior (hashAnterior -&gt; hash), entonces si alguien edita algo después la cadena deja de cuadrar y verificarIntegridad() lo agarra. Esto es literal lo que pide el proyecto en la parte de auditoría.</w:t>
       </w:r>
     </w:p>
     <w:p>
@@ -17238,21 +16582,7 @@
         <w:rPr>
           <w:rFonts w:ascii="Times New Roman" w:hAnsi="Times New Roman" w:cs="Times New Roman"/>
         </w:rPr>
-        <w:t xml:space="preserve">Y PoolConexionesDB, pensando en que esto en teoría podría usarse para una elección nacional con un montón de gente votando a la vez: si cada petición abriera su propia conexión </w:t>
-      </w:r>
-      <w:proofErr w:type="gramStart"/>
-      <w:r>
-        <w:rPr>
-          <w:rFonts w:ascii="Times New Roman" w:hAnsi="Times New Roman" w:cs="Times New Roman"/>
-        </w:rPr>
-        <w:t>a la BD</w:t>
-      </w:r>
-      <w:proofErr w:type="gramEnd"/>
-      <w:r>
-        <w:rPr>
-          <w:rFonts w:ascii="Times New Roman" w:hAnsi="Times New Roman" w:cs="Times New Roman"/>
-        </w:rPr>
-        <w:t xml:space="preserve"> sin control, </w:t>
+        <w:t xml:space="preserve">Y PoolConexionesDB, pensando en que esto en teoría podría usarse para una elección nacional con un montón de gente votando a la vez: si cada petición abriera su propia conexión a la BD sin control, </w:t>
       </w:r>
       <w:r>
         <w:rPr>
@@ -17283,35 +16613,7 @@
         <w:rPr>
           <w:rFonts w:ascii="Times New Roman" w:hAnsi="Times New Roman" w:cs="Times New Roman"/>
         </w:rPr>
-        <w:t xml:space="preserve">Con SOLID: por un </w:t>
-      </w:r>
-      <w:proofErr w:type="gramStart"/>
-      <w:r>
-        <w:rPr>
-          <w:rFonts w:ascii="Times New Roman" w:hAnsi="Times New Roman" w:cs="Times New Roman"/>
-        </w:rPr>
-        <w:t>lado</w:t>
-      </w:r>
-      <w:proofErr w:type="gramEnd"/>
-      <w:r>
-        <w:rPr>
-          <w:rFonts w:ascii="Times New Roman" w:hAnsi="Times New Roman" w:cs="Times New Roman"/>
-        </w:rPr>
-        <w:t xml:space="preserve"> cumple Responsabilidad Única porque cada clase además de hacer lo suyo también controla su propia creación (el #instancia y el bloqueo en el constructor). Por otro lado, hay que admitir que rompe un poco Inversión de Dependencias, porque llamar </w:t>
-      </w:r>
-      <w:proofErr w:type="gramStart"/>
-      <w:r>
-        <w:rPr>
-          <w:rFonts w:ascii="Times New Roman" w:hAnsi="Times New Roman" w:cs="Times New Roman"/>
-        </w:rPr>
-        <w:t>obtenerInstancia(</w:t>
-      </w:r>
-      <w:proofErr w:type="gramEnd"/>
-      <w:r>
-        <w:rPr>
-          <w:rFonts w:ascii="Times New Roman" w:hAnsi="Times New Roman" w:cs="Times New Roman"/>
-        </w:rPr>
-        <w:t>) desde cualquier lado del código te acopla directamente a esa clase en vez de depender de una abstracción. Aun así, para estos tres casos me pareció que valía la pena ese acoplamiento a cambio de tener una única fuente de verdad.</w:t>
+        <w:t>Con SOLID: por un lado cumple Responsabilidad Única porque cada clase además de hacer lo suyo también controla su propia creación (el #instancia y el bloqueo en el constructor). Por otro lado, hay que admitir que rompe un poco Inversión de Dependencias, porque llamar obtenerInstancia() desde cualquier lado del código te acopla directamente a esa clase en vez de depender de una abstracción. Aun así, para estos tres casos me pareció que valía la pena ese acoplamiento a cambio de tener una única fuente de verdad.</w:t>
       </w:r>
     </w:p>
     <w:p>
@@ -17453,7 +16755,6 @@
         <w:rPr>
           <w:rFonts w:ascii="Times New Roman" w:hAnsi="Times New Roman" w:cs="Times New Roman"/>
           <w:noProof/>
-          <w:lang w:eastAsia="es-CO"/>
         </w:rPr>
         <w:lastRenderedPageBreak/>
         <w:drawing>
@@ -17539,7 +16840,7 @@
           <w:lang w:val="es-ES"/>
         </w:rPr>
       </w:pPr>
-      <w:bookmarkStart w:id="3" w:name="_Toc240113605"/>
+      <w:bookmarkStart w:id="2" w:name="_Toc240113605"/>
       <w:r>
         <w:rPr>
           <w:rFonts w:ascii="Times New Roman" w:hAnsi="Times New Roman" w:cs="Times New Roman"/>
@@ -17563,7 +16864,7 @@
         </w:rPr>
         <w:t>04/09:</w:t>
       </w:r>
-      <w:bookmarkEnd w:id="3"/>
+      <w:bookmarkEnd w:id="2"/>
     </w:p>
     <w:p>
       <w:pPr>
@@ -17795,8 +17096,7 @@
           <w:lang w:val="en-US" w:eastAsia="es-ES"/>
         </w:rPr>
       </w:pPr>
-      <w:bookmarkStart w:id="4" w:name="_Hlk239450682"/>
-      <w:proofErr w:type="gramStart"/>
+      <w:bookmarkStart w:id="3" w:name="_Hlk239450682"/>
       <w:r>
         <w:rPr>
           <w:rFonts w:ascii="Consolas" w:eastAsia="Times New Roman" w:hAnsi="Consolas" w:cs="Times New Roman"/>
@@ -17807,7 +17107,6 @@
         </w:rPr>
         <w:t>if</w:t>
       </w:r>
-      <w:proofErr w:type="gramEnd"/>
       <w:r>
         <w:rPr>
           <w:rFonts w:ascii="Consolas" w:eastAsia="Times New Roman" w:hAnsi="Consolas" w:cs="Times New Roman"/>
@@ -17892,7 +17191,6 @@
           <w:lang w:val="en-US" w:eastAsia="es-ES"/>
         </w:rPr>
       </w:pPr>
-      <w:proofErr w:type="gramStart"/>
       <w:r>
         <w:rPr>
           <w:rFonts w:ascii="Consolas" w:eastAsia="Times New Roman" w:hAnsi="Consolas" w:cs="Times New Roman"/>
@@ -17903,7 +17201,6 @@
         </w:rPr>
         <w:t>reporte</w:t>
       </w:r>
-      <w:proofErr w:type="gramEnd"/>
       <w:r>
         <w:rPr>
           <w:rFonts w:ascii="Consolas" w:eastAsia="Times New Roman" w:hAnsi="Consolas" w:cs="Times New Roman"/>
@@ -18111,7 +17408,6 @@
           <w:lang w:val="en-US" w:eastAsia="es-ES"/>
         </w:rPr>
       </w:pPr>
-      <w:proofErr w:type="gramStart"/>
       <w:r>
         <w:rPr>
           <w:rFonts w:ascii="Consolas" w:eastAsia="Times New Roman" w:hAnsi="Consolas" w:cs="Times New Roman"/>
@@ -18122,7 +17418,6 @@
         </w:rPr>
         <w:t>reporte</w:t>
       </w:r>
-      <w:proofErr w:type="gramEnd"/>
       <w:r>
         <w:rPr>
           <w:rFonts w:ascii="Consolas" w:eastAsia="Times New Roman" w:hAnsi="Consolas" w:cs="Times New Roman"/>
@@ -18319,7 +17614,7 @@
         <w:t>Problema identificado</w:t>
       </w:r>
     </w:p>
-    <w:bookmarkEnd w:id="4"/>
+    <w:bookmarkEnd w:id="3"/>
     <w:p>
       <w:pPr>
         <w:spacing w:line="360" w:lineRule="auto"/>
@@ -18449,7 +17744,27 @@
           <w:sz w:val="24"/>
           <w:szCs w:val="24"/>
         </w:rPr>
-        <w:t>La estructura utilizada permite manejar diferentes formatos mediante productos concretos y creadores concretos.</w:t>
+        <w:t xml:space="preserve">La estructura utilizada permite manejar diferentes formatos mediante </w:t>
+      </w:r>
+      <w:proofErr w:type="gramStart"/>
+      <w:r>
+        <w:rPr>
+          <w:rFonts w:ascii="Times New Roman" w:hAnsi="Times New Roman" w:cs="Times New Roman"/>
+          <w:bCs/>
+          <w:sz w:val="24"/>
+          <w:szCs w:val="24"/>
+        </w:rPr>
+        <w:t>productos concretos y creadores concretos</w:t>
+      </w:r>
+      <w:proofErr w:type="gramEnd"/>
+      <w:r>
+        <w:rPr>
+          <w:rFonts w:ascii="Times New Roman" w:hAnsi="Times New Roman" w:cs="Times New Roman"/>
+          <w:bCs/>
+          <w:sz w:val="24"/>
+          <w:szCs w:val="24"/>
+        </w:rPr>
+        <w:t>.</w:t>
       </w:r>
     </w:p>
     <w:p>
@@ -18877,7 +18192,27 @@
           <w:sz w:val="24"/>
           <w:szCs w:val="24"/>
         </w:rPr>
-        <w:t>SRP (Single Responsibility Principle):</w:t>
+        <w:t>SRP (</w:t>
+      </w:r>
+      <w:proofErr w:type="gramStart"/>
+      <w:r>
+        <w:rPr>
+          <w:rFonts w:ascii="Times New Roman" w:hAnsi="Times New Roman" w:cs="Times New Roman"/>
+          <w:b/>
+          <w:sz w:val="24"/>
+          <w:szCs w:val="24"/>
+        </w:rPr>
+        <w:t>Single</w:t>
+      </w:r>
+      <w:proofErr w:type="gramEnd"/>
+      <w:r>
+        <w:rPr>
+          <w:rFonts w:ascii="Times New Roman" w:hAnsi="Times New Roman" w:cs="Times New Roman"/>
+          <w:b/>
+          <w:sz w:val="24"/>
+          <w:szCs w:val="24"/>
+        </w:rPr>
+        <w:t xml:space="preserve"> Responsibility Principle):</w:t>
       </w:r>
     </w:p>
     <w:p>
@@ -19400,7 +18735,6 @@
           <w:noProof/>
           <w:sz w:val="24"/>
           <w:szCs w:val="24"/>
-          <w:lang w:eastAsia="es-CO"/>
         </w:rPr>
         <w:drawing>
           <wp:inline distT="0" distB="0" distL="0" distR="0" wp14:anchorId="33C35111" wp14:editId="759987BA">
@@ -19473,7 +18807,6 @@
           <w:lang w:val="en-US"/>
         </w:rPr>
       </w:pPr>
-      <w:proofErr w:type="gramStart"/>
       <w:r>
         <w:rPr>
           <w:rFonts w:ascii="Times New Roman" w:hAnsi="Times New Roman" w:cs="Times New Roman"/>
@@ -19484,7 +18817,6 @@
         </w:rPr>
         <w:t>PASS  Semana04</w:t>
       </w:r>
-      <w:proofErr w:type="gramEnd"/>
       <w:r>
         <w:rPr>
           <w:rFonts w:ascii="Times New Roman" w:hAnsi="Times New Roman" w:cs="Times New Roman"/>
@@ -19519,7 +18851,6 @@
           <w:lang w:val="en-US"/>
         </w:rPr>
       </w:pPr>
-      <w:proofErr w:type="gramStart"/>
       <w:r>
         <w:rPr>
           <w:rFonts w:ascii="Times New Roman" w:hAnsi="Times New Roman" w:cs="Times New Roman"/>
@@ -19528,18 +18859,7 @@
           <w:szCs w:val="24"/>
           <w:lang w:val="en-US"/>
         </w:rPr>
-        <w:t>PASS  Semana03</w:t>
-      </w:r>
-      <w:proofErr w:type="gramEnd"/>
-      <w:r>
-        <w:rPr>
-          <w:rFonts w:ascii="Times New Roman" w:hAnsi="Times New Roman" w:cs="Times New Roman"/>
-          <w:b/>
-          <w:sz w:val="24"/>
-          <w:szCs w:val="24"/>
-          <w:lang w:val="en-US"/>
-        </w:rPr>
-        <w:t>/__tests__/singleton.test.js</w:t>
+        <w:t>PASS  Semana03/__tests__/singleton.test.js</w:t>
       </w:r>
     </w:p>
     <w:p>
@@ -20101,7 +19421,6 @@
           <w:noProof/>
           <w:sz w:val="24"/>
           <w:szCs w:val="24"/>
-          <w:lang w:eastAsia="es-CO"/>
         </w:rPr>
         <w:drawing>
           <wp:inline distT="0" distB="0" distL="0" distR="0" wp14:anchorId="4E70D207" wp14:editId="5936236B">
@@ -20181,7 +19500,6 @@
           <w:noProof/>
           <w:sz w:val="24"/>
           <w:szCs w:val="24"/>
-          <w:lang w:eastAsia="es-CO"/>
         </w:rPr>
         <w:drawing>
           <wp:inline distT="0" distB="0" distL="0" distR="0" wp14:anchorId="6C36147D" wp14:editId="2F979CD5">
@@ -20265,7 +19583,6 @@
           <w:noProof/>
           <w:sz w:val="24"/>
           <w:szCs w:val="24"/>
-          <w:lang w:eastAsia="es-CO"/>
         </w:rPr>
         <w:drawing>
           <wp:inline distT="0" distB="0" distL="0" distR="0" wp14:anchorId="3E857DEC" wp14:editId="25BD08DA">
@@ -20338,7 +19655,6 @@
       <w:r>
         <w:rPr>
           <w:noProof/>
-          <w:lang w:eastAsia="es-CO"/>
         </w:rPr>
         <w:drawing>
           <wp:inline distT="0" distB="0" distL="0" distR="0" wp14:anchorId="10916EDA" wp14:editId="7B0696A8">
@@ -20411,6 +19727,101 @@
     </w:p>
     <w:p>
       <w:pPr>
+        <w:jc w:val="center"/>
+        <w:rPr>
+          <w:rFonts w:ascii="Times New Roman" w:hAnsi="Times New Roman" w:cs="Times New Roman"/>
+          <w:b/>
+          <w:bCs/>
+          <w:sz w:val="24"/>
+          <w:szCs w:val="24"/>
+          <w:lang w:val="es-ES"/>
+        </w:rPr>
+      </w:pPr>
+      <w:r>
+        <w:rPr>
+          <w:rFonts w:ascii="Times New Roman" w:hAnsi="Times New Roman" w:cs="Times New Roman"/>
+          <w:b/>
+          <w:bCs/>
+          <w:sz w:val="24"/>
+          <w:szCs w:val="24"/>
+          <w:lang w:val="es-ES"/>
+        </w:rPr>
+        <w:lastRenderedPageBreak/>
+        <w:t xml:space="preserve">FASE 2 - </w:t>
+      </w:r>
+      <w:r>
+        <w:rPr>
+          <w:rFonts w:ascii="Times New Roman" w:hAnsi="Times New Roman" w:cs="Times New Roman"/>
+          <w:b/>
+          <w:bCs/>
+          <w:sz w:val="24"/>
+          <w:szCs w:val="24"/>
+          <w:lang w:val="es-ES"/>
+        </w:rPr>
+        <w:t xml:space="preserve">Patrón </w:t>
+      </w:r>
+      <w:r>
+        <w:rPr>
+          <w:rFonts w:ascii="Times New Roman" w:hAnsi="Times New Roman" w:cs="Times New Roman"/>
+          <w:b/>
+          <w:bCs/>
+          <w:sz w:val="24"/>
+          <w:szCs w:val="24"/>
+          <w:lang w:val="es-ES"/>
+        </w:rPr>
+        <w:t>Abstract</w:t>
+      </w:r>
+      <w:r>
+        <w:rPr>
+          <w:rFonts w:ascii="Times New Roman" w:hAnsi="Times New Roman" w:cs="Times New Roman"/>
+          <w:b/>
+          <w:bCs/>
+          <w:sz w:val="24"/>
+          <w:szCs w:val="24"/>
+          <w:lang w:val="es-ES"/>
+        </w:rPr>
+        <w:t xml:space="preserve"> </w:t>
+      </w:r>
+      <w:r>
+        <w:rPr>
+          <w:rFonts w:ascii="Times New Roman" w:hAnsi="Times New Roman" w:cs="Times New Roman"/>
+          <w:b/>
+          <w:bCs/>
+          <w:sz w:val="24"/>
+          <w:szCs w:val="24"/>
+          <w:lang w:val="es-ES"/>
+        </w:rPr>
+        <w:t>Factory</w:t>
+      </w:r>
+    </w:p>
+    <w:p>
+      <w:pPr>
+        <w:jc w:val="center"/>
+        <w:rPr>
+          <w:rFonts w:ascii="Times New Roman" w:hAnsi="Times New Roman" w:cs="Times New Roman"/>
+          <w:b/>
+          <w:bCs/>
+          <w:sz w:val="24"/>
+          <w:szCs w:val="24"/>
+          <w:lang w:val="es-ES"/>
+        </w:rPr>
+      </w:pPr>
+    </w:p>
+    <w:p>
+      <w:pPr>
+        <w:jc w:val="center"/>
+        <w:rPr>
+          <w:rFonts w:ascii="Times New Roman" w:hAnsi="Times New Roman" w:cs="Times New Roman"/>
+          <w:b/>
+          <w:bCs/>
+          <w:sz w:val="24"/>
+          <w:szCs w:val="24"/>
+          <w:lang w:val="es-ES"/>
+        </w:rPr>
+      </w:pPr>
+    </w:p>
+    <w:p>
+      <w:pPr>
         <w:pStyle w:val="Ttulo1"/>
         <w:ind w:firstLine="708"/>
         <w:rPr>
@@ -20421,7 +19832,7 @@
           <w:lang w:val="es-ES"/>
         </w:rPr>
       </w:pPr>
-      <w:bookmarkStart w:id="5" w:name="_Toc240113606"/>
+      <w:bookmarkStart w:id="4" w:name="_Toc240113606"/>
       <w:r>
         <w:rPr>
           <w:rFonts w:ascii="Times New Roman" w:hAnsi="Times New Roman" w:cs="Times New Roman"/>
@@ -20432,7 +19843,6 @@
           <w:szCs w:val="24"/>
           <w:lang w:val="es-ES"/>
         </w:rPr>
-        <w:lastRenderedPageBreak/>
         <w:t>Semana5</w:t>
       </w:r>
       <w:r>
@@ -20445,7 +19855,7 @@
         </w:rPr>
         <w:t xml:space="preserve"> 12/09</w:t>
       </w:r>
-      <w:bookmarkEnd w:id="5"/>
+      <w:bookmarkEnd w:id="4"/>
     </w:p>
     <w:p>
       <w:pPr>
@@ -20713,27 +20123,7 @@
           <w:szCs w:val="24"/>
           <w:lang w:val="es-ES"/>
         </w:rPr>
-        <w:t xml:space="preserve">public </w:t>
-      </w:r>
-      <w:proofErr w:type="gramStart"/>
-      <w:r>
-        <w:rPr>
-          <w:rFonts w:ascii="Times New Roman" w:hAnsi="Times New Roman" w:cs="Times New Roman"/>
-          <w:sz w:val="24"/>
-          <w:szCs w:val="24"/>
-          <w:lang w:val="es-ES"/>
-        </w:rPr>
-        <w:t>Eleccion(</w:t>
-      </w:r>
-      <w:proofErr w:type="gramEnd"/>
-      <w:r>
-        <w:rPr>
-          <w:rFonts w:ascii="Times New Roman" w:hAnsi="Times New Roman" w:cs="Times New Roman"/>
-          <w:sz w:val="24"/>
-          <w:szCs w:val="24"/>
-          <w:lang w:val="es-ES"/>
-        </w:rPr>
-        <w:t>nombre, candidatos, mesas, fechaApertura, fechaCierre, permiteVotoBlanco, umbralQuorum) { ... }</w:t>
+        <w:t>public Eleccion(nombre, candidatos, mesas, fechaApertura, fechaCierre, permiteVotoBlanco, umbralQuorum) { ... }</w:t>
       </w:r>
     </w:p>
     <w:p>
@@ -21133,7 +20523,6 @@
           <w:noProof/>
           <w:sz w:val="24"/>
           <w:szCs w:val="24"/>
-          <w:lang w:eastAsia="es-CO"/>
         </w:rPr>
         <w:lastRenderedPageBreak/>
         <w:drawing>
@@ -21348,47 +20737,7 @@
           <w:szCs w:val="24"/>
           <w:lang w:val="es-ES"/>
         </w:rPr>
-        <w:t xml:space="preserve">El Director orquesta la construcción llamando, en orden, a los métodos del Builder: </w:t>
-      </w:r>
-      <w:proofErr w:type="gramStart"/>
-      <w:r>
-        <w:rPr>
-          <w:rFonts w:ascii="Times New Roman" w:hAnsi="Times New Roman" w:cs="Times New Roman"/>
-          <w:sz w:val="24"/>
-          <w:szCs w:val="24"/>
-          <w:lang w:val="es-ES"/>
-        </w:rPr>
-        <w:t>definirNombre(</w:t>
-      </w:r>
-      <w:proofErr w:type="gramEnd"/>
-      <w:r>
-        <w:rPr>
-          <w:rFonts w:ascii="Times New Roman" w:hAnsi="Times New Roman" w:cs="Times New Roman"/>
-          <w:sz w:val="24"/>
-          <w:szCs w:val="24"/>
-          <w:lang w:val="es-ES"/>
-        </w:rPr>
-        <w:t xml:space="preserve">), agregarCandidato() (una vez por cada candidato), agregarMesa() (una vez por cada mesa), definirFechas(), permitirVotoBlanco() y definirQuorum(). Al final, </w:t>
-      </w:r>
-      <w:proofErr w:type="gramStart"/>
-      <w:r>
-        <w:rPr>
-          <w:rFonts w:ascii="Times New Roman" w:hAnsi="Times New Roman" w:cs="Times New Roman"/>
-          <w:sz w:val="24"/>
-          <w:szCs w:val="24"/>
-          <w:lang w:val="es-ES"/>
-        </w:rPr>
-        <w:t>obtenerEleccion(</w:t>
-      </w:r>
-      <w:proofErr w:type="gramEnd"/>
-      <w:r>
-        <w:rPr>
-          <w:rFonts w:ascii="Times New Roman" w:hAnsi="Times New Roman" w:cs="Times New Roman"/>
-          <w:sz w:val="24"/>
-          <w:szCs w:val="24"/>
-          <w:lang w:val="es-ES"/>
-        </w:rPr>
-        <w:t>) entrega el objeto completo.</w:t>
+        <w:t>El Director orquesta la construcción llamando, en orden, a los métodos del Builder: definirNombre(), agregarCandidato() (una vez por cada candidato), agregarMesa() (una vez por cada mesa), definirFechas(), permitirVotoBlanco() y definirQuorum(). Al final, obtenerEleccion() entrega el objeto completo.</w:t>
       </w:r>
     </w:p>
     <w:p>
@@ -21558,7 +20907,31 @@
           <w:szCs w:val="24"/>
           <w:lang w:val="es-ES"/>
         </w:rPr>
-        <w:t>SRP (Single Responsibility Principle):</w:t>
+        <w:t>SRP (</w:t>
+      </w:r>
+      <w:proofErr w:type="gramStart"/>
+      <w:r>
+        <w:rPr>
+          <w:rFonts w:ascii="Times New Roman" w:hAnsi="Times New Roman" w:cs="Times New Roman"/>
+          <w:b/>
+          <w:bCs/>
+          <w:sz w:val="24"/>
+          <w:szCs w:val="24"/>
+          <w:lang w:val="es-ES"/>
+        </w:rPr>
+        <w:t>Single</w:t>
+      </w:r>
+      <w:proofErr w:type="gramEnd"/>
+      <w:r>
+        <w:rPr>
+          <w:rFonts w:ascii="Times New Roman" w:hAnsi="Times New Roman" w:cs="Times New Roman"/>
+          <w:b/>
+          <w:bCs/>
+          <w:sz w:val="24"/>
+          <w:szCs w:val="24"/>
+          <w:lang w:val="es-ES"/>
+        </w:rPr>
+        <w:t xml:space="preserve"> Responsibility Principle):</w:t>
       </w:r>
     </w:p>
     <w:p>
@@ -22044,7 +21417,7 @@
           <w:noProof/>
           <w:sz w:val="24"/>
           <w:szCs w:val="24"/>
-          <w:lang w:eastAsia="es-CO"/>
+          <w:lang w:val="en-US"/>
         </w:rPr>
         <w:drawing>
           <wp:inline distT="0" distB="0" distL="0" distR="0" wp14:anchorId="13005177" wp14:editId="0E41F09D">
@@ -22167,7 +21540,7 @@
           <w:noProof/>
           <w:sz w:val="24"/>
           <w:szCs w:val="24"/>
-          <w:lang w:eastAsia="es-CO"/>
+          <w:lang w:val="es-ES"/>
         </w:rPr>
         <w:lastRenderedPageBreak/>
         <w:drawing>
@@ -22234,7 +21607,7 @@
           <w:noProof/>
           <w:sz w:val="24"/>
           <w:szCs w:val="24"/>
-          <w:lang w:eastAsia="es-CO"/>
+          <w:lang w:val="es-ES"/>
         </w:rPr>
         <w:lastRenderedPageBreak/>
         <w:drawing>
@@ -22279,7 +21652,7 @@
           <w:noProof/>
           <w:sz w:val="24"/>
           <w:szCs w:val="24"/>
-          <w:lang w:eastAsia="es-CO"/>
+          <w:lang w:val="es-ES"/>
         </w:rPr>
         <w:lastRenderedPageBreak/>
         <w:drawing>
@@ -22397,7 +21770,7 @@
           <w:noProof/>
           <w:sz w:val="24"/>
           <w:szCs w:val="24"/>
-          <w:lang w:eastAsia="es-CO"/>
+          <w:lang w:val="es-ES"/>
         </w:rPr>
         <w:lastRenderedPageBreak/>
         <w:drawing>
@@ -22856,7 +22229,7 @@
           <w:noProof/>
           <w:sz w:val="24"/>
           <w:szCs w:val="24"/>
-          <w:lang w:eastAsia="es-CO"/>
+          <w:lang w:val="es-ES"/>
         </w:rPr>
         <w:lastRenderedPageBreak/>
         <w:drawing>
@@ -22901,7 +22274,7 @@
           <w:noProof/>
           <w:sz w:val="24"/>
           <w:szCs w:val="24"/>
-          <w:lang w:eastAsia="es-CO"/>
+          <w:lang w:val="es-ES"/>
         </w:rPr>
         <w:drawing>
           <wp:inline distT="0" distB="0" distL="0" distR="0" wp14:anchorId="746022BA" wp14:editId="46B8FF07">
@@ -22945,7 +22318,7 @@
           <w:noProof/>
           <w:sz w:val="24"/>
           <w:szCs w:val="24"/>
-          <w:lang w:eastAsia="es-CO"/>
+          <w:lang w:val="es-ES"/>
         </w:rPr>
         <w:drawing>
           <wp:inline distT="0" distB="0" distL="0" distR="0" wp14:anchorId="1AF1F0B6" wp14:editId="578CC905">
@@ -22989,7 +22362,7 @@
           <w:noProof/>
           <w:sz w:val="24"/>
           <w:szCs w:val="24"/>
-          <w:lang w:eastAsia="es-CO"/>
+          <w:lang w:val="es-ES"/>
         </w:rPr>
         <w:drawing>
           <wp:inline distT="0" distB="0" distL="0" distR="0" wp14:anchorId="29A173E4" wp14:editId="6080DC32">
@@ -23538,7 +22911,7 @@
           <w:noProof/>
           <w:sz w:val="24"/>
           <w:szCs w:val="24"/>
-          <w:lang w:eastAsia="es-CO"/>
+          <w:lang w:val="es-ES"/>
         </w:rPr>
         <w:drawing>
           <wp:inline distT="0" distB="0" distL="0" distR="0" wp14:anchorId="1CF75EE5" wp14:editId="071A17D6">
@@ -23604,7 +22977,7 @@
           <w:noProof/>
           <w:sz w:val="24"/>
           <w:szCs w:val="24"/>
-          <w:lang w:eastAsia="es-CO"/>
+          <w:lang w:val="es-ES"/>
         </w:rPr>
         <w:drawing>
           <wp:inline distT="0" distB="0" distL="0" distR="0" wp14:anchorId="2421C649" wp14:editId="626DD95C">
@@ -23697,6 +23070,32 @@
     </w:p>
     <w:p>
       <w:pPr>
+        <w:jc w:val="both"/>
+        <w:rPr>
+          <w:rFonts w:ascii="Times New Roman" w:hAnsi="Times New Roman" w:cs="Times New Roman"/>
+          <w:b/>
+          <w:bCs/>
+          <w:sz w:val="24"/>
+          <w:szCs w:val="24"/>
+          <w:lang w:val="es-ES"/>
+        </w:rPr>
+      </w:pPr>
+    </w:p>
+    <w:p>
+      <w:pPr>
+        <w:jc w:val="center"/>
+        <w:rPr>
+          <w:rFonts w:ascii="Times New Roman" w:hAnsi="Times New Roman" w:cs="Times New Roman"/>
+          <w:b/>
+          <w:bCs/>
+          <w:sz w:val="24"/>
+          <w:szCs w:val="24"/>
+          <w:lang w:val="es-ES"/>
+        </w:rPr>
+      </w:pPr>
+    </w:p>
+    <w:p>
+      <w:pPr>
         <w:spacing w:line="360" w:lineRule="auto"/>
         <w:jc w:val="both"/>
         <w:rPr>
@@ -23718,7 +23117,7 @@
 </file>
 
 <file path=word/numbering.xml><?xml version="1.0" encoding="utf-8"?>
-<w:numbering xmlns:wpc="http://schemas.microsoft.com/office/word/2010/wordprocessingCanvas" xmlns:cx="http://schemas.microsoft.com/office/drawing/2014/chartex" xmlns:cx1="http://schemas.microsoft.com/office/drawing/2015/9/8/chartex" xmlns:mc="http://schemas.openxmlformats.org/markup-compatibility/2006" xmlns:o="urn:schemas-microsoft-com:office:office" xmlns:r="http://schemas.openxmlformats.org/officeDocument/2006/relationships" xmlns:m="http://schemas.openxmlformats.org/officeDocument/2006/math" xmlns:v="urn:schemas-microsoft-com:vml" xmlns:wp14="http://schemas.microsoft.com/office/word/2010/wordprocessingDrawing" xmlns:wp="http://schemas.openxmlformats.org/drawingml/2006/wordprocessingDrawing" xmlns:w10="urn:schemas-microsoft-com:office:word" xmlns:w="http://schemas.openxmlformats.org/wordprocessingml/2006/main" xmlns:w14="http://schemas.microsoft.com/office/word/2010/wordml" xmlns:w15="http://schemas.microsoft.com/office/word/2012/wordml" xmlns:w16se="http://schemas.microsoft.com/office/word/2015/wordml/symex" xmlns:wpg="http://schemas.microsoft.com/office/word/2010/wordprocessingGroup" xmlns:wpi="http://schemas.microsoft.com/office/word/2010/wordprocessingInk" xmlns:wne="http://schemas.microsoft.com/office/word/2006/wordml" xmlns:wps="http://schemas.microsoft.com/office/word/2010/wordprocessingShape" mc:Ignorable="w14 w15 w16se wp14">
+<w:numbering xmlns:wpc="http://schemas.microsoft.com/office/word/2010/wordprocessingCanvas" xmlns:cx="http://schemas.microsoft.com/office/drawing/2014/chartex" xmlns:cx1="http://schemas.microsoft.com/office/drawing/2015/9/8/chartex" xmlns:cx2="http://schemas.microsoft.com/office/drawing/2015/10/21/chartex" xmlns:cx3="http://schemas.microsoft.com/office/drawing/2016/5/9/chartex" xmlns:cx4="http://schemas.microsoft.com/office/drawing/2016/5/10/chartex" xmlns:cx5="http://schemas.microsoft.com/office/drawing/2016/5/11/chartex" xmlns:cx6="http://schemas.microsoft.com/office/drawing/2016/5/12/chartex" xmlns:cx7="http://schemas.microsoft.com/office/drawing/2016/5/13/chartex" xmlns:cx8="http://schemas.microsoft.com/office/drawing/2016/5/14/chartex" xmlns:mc="http://schemas.openxmlformats.org/markup-compatibility/2006" xmlns:aink="http://schemas.microsoft.com/office/drawing/2016/ink" xmlns:am3d="http://schemas.microsoft.com/office/drawing/2017/model3d" xmlns:o="urn:schemas-microsoft-com:office:office" xmlns:oel="http://schemas.microsoft.com/office/2019/extlst" xmlns:r="http://schemas.openxmlformats.org/officeDocument/2006/relationships" xmlns:m="http://schemas.openxmlformats.org/officeDocument/2006/math" xmlns:v="urn:schemas-microsoft-com:vml" xmlns:wp14="http://schemas.microsoft.com/office/word/2010/wordprocessingDrawing" xmlns:wp="http://schemas.openxmlformats.org/drawingml/2006/wordprocessingDrawing" xmlns:w10="urn:schemas-microsoft-com:office:word" xmlns:w="http://schemas.openxmlformats.org/wordprocessingml/2006/main" xmlns:w14="http://schemas.microsoft.com/office/word/2010/wordml" xmlns:w15="http://schemas.microsoft.com/office/word/2012/wordml" xmlns:w16cex="http://schemas.microsoft.com/office/word/2018/wordml/cex" xmlns:w16cid="http://schemas.microsoft.com/office/word/2016/wordml/cid" xmlns:w16="http://schemas.microsoft.com/office/word/2018/wordml" xmlns:w16du="http://schemas.microsoft.com/office/word/2023/wordml/word16du" xmlns:w16sdtdh="http://schemas.microsoft.com/office/word/2020/wordml/sdtdatahash" xmlns:w16sdtfl="http://schemas.microsoft.com/office/word/2024/wordml/sdtformatlock" xmlns:w16se="http://schemas.microsoft.com/office/word/2015/wordml/symex" xmlns:wpg="http://schemas.microsoft.com/office/word/2010/wordprocessingGroup" xmlns:wpi="http://schemas.microsoft.com/office/word/2010/wordprocessingInk" xmlns:wne="http://schemas.microsoft.com/office/word/2006/wordml" xmlns:wps="http://schemas.microsoft.com/office/word/2010/wordprocessingShape" mc:Ignorable="w14 w15 w16se w16cid w16 w16cex w16sdtdh w16sdtfl w16du wp14">
   <w:abstractNum w:abstractNumId="0" w15:restartNumberingAfterBreak="0">
     <w:nsid w:val="03F44D97"/>
     <w:multiLevelType w:val="hybridMultilevel"/>
@@ -25661,65 +25060,65 @@
       </w:pPr>
     </w:lvl>
   </w:abstractNum>
-  <w:num w:numId="1">
+  <w:num w:numId="1" w16cid:durableId="675882065">
     <w:abstractNumId w:val="15"/>
   </w:num>
-  <w:num w:numId="2">
+  <w:num w:numId="2" w16cid:durableId="1755082038">
     <w:abstractNumId w:val="16"/>
   </w:num>
-  <w:num w:numId="3">
+  <w:num w:numId="3" w16cid:durableId="357239934">
     <w:abstractNumId w:val="6"/>
   </w:num>
-  <w:num w:numId="4">
+  <w:num w:numId="4" w16cid:durableId="1349257592">
     <w:abstractNumId w:val="14"/>
   </w:num>
-  <w:num w:numId="5">
+  <w:num w:numId="5" w16cid:durableId="1846748031">
     <w:abstractNumId w:val="17"/>
   </w:num>
-  <w:num w:numId="6">
+  <w:num w:numId="6" w16cid:durableId="994184075">
     <w:abstractNumId w:val="11"/>
   </w:num>
-  <w:num w:numId="7">
+  <w:num w:numId="7" w16cid:durableId="112990221">
     <w:abstractNumId w:val="5"/>
   </w:num>
-  <w:num w:numId="8">
+  <w:num w:numId="8" w16cid:durableId="169375867">
     <w:abstractNumId w:val="12"/>
   </w:num>
-  <w:num w:numId="9">
+  <w:num w:numId="9" w16cid:durableId="723257947">
     <w:abstractNumId w:val="8"/>
   </w:num>
-  <w:num w:numId="10">
+  <w:num w:numId="10" w16cid:durableId="844438432">
     <w:abstractNumId w:val="7"/>
   </w:num>
-  <w:num w:numId="11">
+  <w:num w:numId="11" w16cid:durableId="697435540">
     <w:abstractNumId w:val="3"/>
   </w:num>
-  <w:num w:numId="12">
+  <w:num w:numId="12" w16cid:durableId="1259212319">
     <w:abstractNumId w:val="13"/>
   </w:num>
-  <w:num w:numId="13">
+  <w:num w:numId="13" w16cid:durableId="1432621810">
     <w:abstractNumId w:val="2"/>
   </w:num>
-  <w:num w:numId="14">
+  <w:num w:numId="14" w16cid:durableId="683047495">
     <w:abstractNumId w:val="10"/>
   </w:num>
-  <w:num w:numId="15">
+  <w:num w:numId="15" w16cid:durableId="1593276110">
     <w:abstractNumId w:val="0"/>
   </w:num>
-  <w:num w:numId="16">
+  <w:num w:numId="16" w16cid:durableId="69549417">
     <w:abstractNumId w:val="4"/>
   </w:num>
-  <w:num w:numId="17">
+  <w:num w:numId="17" w16cid:durableId="213349202">
     <w:abstractNumId w:val="9"/>
   </w:num>
-  <w:num w:numId="18">
+  <w:num w:numId="18" w16cid:durableId="258220887">
     <w:abstractNumId w:val="1"/>
   </w:num>
 </w:numbering>
 </file>
 
 <file path=word/styles.xml><?xml version="1.0" encoding="utf-8"?>
-<w:styles xmlns:mc="http://schemas.openxmlformats.org/markup-compatibility/2006" xmlns:r="http://schemas.openxmlformats.org/officeDocument/2006/relationships" xmlns:w="http://schemas.openxmlformats.org/wordprocessingml/2006/main" xmlns:w14="http://schemas.microsoft.com/office/word/2010/wordml" xmlns:w15="http://schemas.microsoft.com/office/word/2012/wordml" xmlns:w16se="http://schemas.microsoft.com/office/word/2015/wordml/symex" mc:Ignorable="w14 w15 w16se">
+<w:styles xmlns:mc="http://schemas.openxmlformats.org/markup-compatibility/2006" xmlns:r="http://schemas.openxmlformats.org/officeDocument/2006/relationships" xmlns:w="http://schemas.openxmlformats.org/wordprocessingml/2006/main" xmlns:w14="http://schemas.microsoft.com/office/word/2010/wordml" xmlns:w15="http://schemas.microsoft.com/office/word/2012/wordml" xmlns:w16cex="http://schemas.microsoft.com/office/word/2018/wordml/cex" xmlns:w16cid="http://schemas.microsoft.com/office/word/2016/wordml/cid" xmlns:w16="http://schemas.microsoft.com/office/word/2018/wordml" xmlns:w16du="http://schemas.microsoft.com/office/word/2023/wordml/word16du" xmlns:w16sdtdh="http://schemas.microsoft.com/office/word/2020/wordml/sdtdatahash" xmlns:w16sdtfl="http://schemas.microsoft.com/office/word/2024/wordml/sdtformatlock" xmlns:w16se="http://schemas.microsoft.com/office/word/2015/wordml/symex" mc:Ignorable="w14 w15 w16se w16cid w16 w16cex w16sdtdh w16sdtfl w16du">
   <w:docDefaults>
     <w:rPrDefault>
       <w:rPr>
@@ -25735,7 +25134,7 @@
       </w:pPr>
     </w:pPrDefault>
   </w:docDefaults>
-  <w:latentStyles w:defLockedState="0" w:defUIPriority="99" w:defSemiHidden="0" w:defUnhideWhenUsed="0" w:defQFormat="0" w:count="371">
+  <w:latentStyles w:defLockedState="0" w:defUIPriority="99" w:defSemiHidden="0" w:defUnhideWhenUsed="0" w:defQFormat="0" w:count="376">
     <w:lsdException w:name="Normal" w:uiPriority="0" w:qFormat="1"/>
     <w:lsdException w:name="heading 1" w:uiPriority="9" w:qFormat="1"/>
     <w:lsdException w:name="heading 2" w:semiHidden="1" w:uiPriority="9" w:unhideWhenUsed="1" w:qFormat="1"/>
@@ -26107,6 +25506,11 @@
     <w:lsdException w:name="List Table 5 Dark Accent 6" w:uiPriority="50"/>
     <w:lsdException w:name="List Table 6 Colorful Accent 6" w:uiPriority="51"/>
     <w:lsdException w:name="List Table 7 Colorful Accent 6" w:uiPriority="52"/>
+    <w:lsdException w:name="Mention" w:semiHidden="1" w:unhideWhenUsed="1"/>
+    <w:lsdException w:name="Smart Hyperlink" w:semiHidden="1" w:unhideWhenUsed="1"/>
+    <w:lsdException w:name="Hashtag" w:semiHidden="1" w:unhideWhenUsed="1"/>
+    <w:lsdException w:name="Unresolved Mention" w:semiHidden="1" w:unhideWhenUsed="1"/>
+    <w:lsdException w:name="Smart Link" w:semiHidden="1" w:unhideWhenUsed="1"/>
   </w:latentStyles>
   <w:style w:type="paragraph" w:default="1" w:styleId="Normal">
     <w:name w:val="Normal"/>
@@ -26225,7 +25629,7 @@
       </w:tblBorders>
     </w:tblPr>
   </w:style>
-  <w:style w:type="table" w:styleId="Tabladecuadrcula1clara">
+  <w:style w:type="table" w:styleId="Tablaconcuadrcula1clara">
     <w:name w:val="Grid Table 1 Light"/>
     <w:basedOn w:val="Tablanormal"/>
     <w:uiPriority w:val="46"/>
@@ -26282,7 +25686,7 @@
       </w:rPr>
     </w:tblStylePr>
   </w:style>
-  <w:style w:type="table" w:styleId="Tabladecuadrcula1clara-nfasis1">
+  <w:style w:type="table" w:styleId="Tablaconcuadrcula1clara-nfasis1">
     <w:name w:val="Grid Table 1 Light Accent 1"/>
     <w:basedOn w:val="Tablanormal"/>
     <w:uiPriority w:val="46"/>
@@ -26339,7 +25743,7 @@
       </w:rPr>
     </w:tblStylePr>
   </w:style>
-  <w:style w:type="table" w:styleId="Tabladecuadrcula1Claro-nfasis2">
+  <w:style w:type="table" w:styleId="Tablaconcuadrcula1Claro-nfasis2">
     <w:name w:val="Grid Table 1 Light Accent 2"/>
     <w:basedOn w:val="Tablanormal"/>
     <w:uiPriority w:val="46"/>
@@ -26819,7 +26223,7 @@
 </file>
 
 <file path=customXml/itemProps1.xml><?xml version="1.0" encoding="utf-8"?>
-<ds:datastoreItem xmlns:ds="http://schemas.openxmlformats.org/officeDocument/2006/customXml" ds:itemID="{923C455B-6B4E-41B0-9D12-86076C45507A}">
+<ds:datastoreItem xmlns:ds="http://schemas.openxmlformats.org/officeDocument/2006/customXml" ds:itemID="{FE94A308-CBD7-4CAE-AD0F-966708BCE969}">
   <ds:schemaRefs>
     <ds:schemaRef ds:uri="http://schemas.openxmlformats.org/officeDocument/2006/bibliography"/>
   </ds:schemaRefs>

</xml_diff>